<commit_message>
Ticket de pesee : intitules alignes en colonnes (ex. Poids entre / Poids sortie exactement l'un au-dessus de l'autre) et elements d'une meme rangee sur la meme ligne ; deplacement maximal d'un intitule 1,1 mm ; Dont : Humidite / Autres MC alignes a droite comme dans le modele
</commit_message>
<xml_diff>
--- a/modeles/ticket_de_pesee.docx
+++ b/modeles/ticket_de_pesee.docx
@@ -695,6 +695,7 @@
                               <w:tabs>
                                 <w:tab w:val="right" w:pos="2866"/>
                               </w:tabs>
+                              <w:ind w:left="12"/>
                               <w:rPr>
                                 <w:rFonts w:ascii="Arial" w:hAnsi="Arial" w:cs="Arial"/>
                                 <w:sz w:val="12"/>
@@ -778,6 +779,7 @@
                         <w:tabs>
                           <w:tab w:val="right" w:pos="2866"/>
                         </w:tabs>
+                        <w:ind w:left="12"/>
                         <w:rPr>
                           <w:rFonts w:ascii="Arial" w:hAnsi="Arial" w:cs="Arial"/>
                           <w:sz w:val="12"/>
@@ -895,6 +897,7 @@
                               <w:tabs>
                                 <w:tab w:val="right" w:pos="2879"/>
                               </w:tabs>
+                              <w:ind w:left="25"/>
                               <w:rPr>
                                 <w:rFonts w:ascii="Arial" w:hAnsi="Arial" w:cs="Arial"/>
                                 <w:sz w:val="12"/>
@@ -954,6 +957,7 @@
                         <w:tabs>
                           <w:tab w:val="right" w:pos="2879"/>
                         </w:tabs>
+                        <w:ind w:left="25"/>
                         <w:rPr>
                           <w:rFonts w:ascii="Arial" w:hAnsi="Arial" w:cs="Arial"/>
                           <w:sz w:val="12"/>
@@ -1009,7 +1013,7 @@
                   <wp:posOffset>-584200</wp:posOffset>
                 </wp:positionH>
                 <wp:positionV relativeFrom="paragraph">
-                  <wp:posOffset>3079115</wp:posOffset>
+                  <wp:posOffset>3098165</wp:posOffset>
                 </wp:positionV>
                 <wp:extent cx="3103880" cy="230505"/>
                 <wp:effectExtent l="0" t="0" r="0" b="0"/>
@@ -1098,7 +1102,7 @@
           </mc:Choice>
           <mc:Fallback>
             <w:pict>
-              <v:shape w14:anchorId="7F0A9C48" id="_x0000_s1032" type="#_x0000_t202" style="position:absolute;left:0;text-align:left;margin-left:-46pt;margin-top:242.45pt;width:244.4pt;height:18.15pt;z-index:251298816;visibility:visible;mso-wrap-style:square;mso-width-percent:0;mso-height-percent:0;mso-wrap-distance-left:9pt;mso-wrap-distance-top:3.6pt;mso-wrap-distance-right:9pt;mso-wrap-distance-bottom:3.6pt;mso-position-horizontal:absolute;mso-position-horizontal-relative:margin;mso-position-vertical:absolute;mso-position-vertical-relative:text;mso-width-percent:0;mso-height-percent:0;mso-width-relative:margin;mso-height-relative:margin;v-text-anchor:top" o:gfxdata="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" filled="f" stroked="f">
+              <v:shape w14:anchorId="7F0A9C48" id="_x0000_s1032" type="#_x0000_t202" style="position:absolute;left:0;text-align:left;margin-left:-46pt;margin-top:243.95pt;width:244.4pt;height:18.15pt;z-index:251298816;visibility:visible;mso-wrap-style:square;mso-width-percent:0;mso-height-percent:0;mso-wrap-distance-left:9pt;mso-wrap-distance-top:3.6pt;mso-wrap-distance-right:9pt;mso-wrap-distance-bottom:3.6pt;mso-position-horizontal:absolute;mso-position-horizontal-relative:margin;mso-position-vertical:absolute;mso-position-vertical-relative:text;mso-width-percent:0;mso-height-percent:0;mso-width-relative:margin;mso-height-relative:margin;v-text-anchor:top" o:gfxdata="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" filled="f" stroked="f">
                 <v:textbox>
                   <w:txbxContent>
                     <w:p>
@@ -1307,7 +1311,7 @@
                   <wp:posOffset>-488315</wp:posOffset>
                 </wp:positionH>
                 <wp:positionV relativeFrom="paragraph">
-                  <wp:posOffset>4479925</wp:posOffset>
+                  <wp:posOffset>4488180</wp:posOffset>
                 </wp:positionV>
                 <wp:extent cx="2174240" cy="228600"/>
                 <wp:effectExtent l="0" t="0" r="0" b="0"/>
@@ -1342,6 +1346,9 @@
                         <w:txbxContent>
                           <w:p>
                             <w:pPr>
+                              <w:tabs>
+                                <w:tab w:val="right" w:pos="2132"/>
+                              </w:tabs>
                               <w:rPr>
                                 <w:rFonts w:ascii="Arial" w:hAnsi="Arial" w:cs="Arial"/>
                                 <w:sz w:val="16"/>
@@ -1354,32 +1361,15 @@
                                 <w:sz w:val="16"/>
                                 <w:szCs w:val="16"/>
                               </w:rPr>
-                              <w:t xml:space="preserve">                       Dont : Humidité</w:t>
-                            </w:r>
-                          </w:p>
-                          <w:p>
-                            <w:pPr>
-                              <w:rPr>
-                                <w:rFonts w:ascii="Arial" w:hAnsi="Arial" w:cs="Arial"/>
-                                <w:sz w:val="16"/>
-                                <w:szCs w:val="16"/>
-                              </w:rPr>
-                            </w:pPr>
-                            <w:r>
-                              <w:rPr>
-                                <w:rFonts w:ascii="Arial" w:hAnsi="Arial" w:cs="Arial"/>
-                                <w:sz w:val="16"/>
-                                <w:szCs w:val="16"/>
-                              </w:rPr>
-                              <w:t xml:space="preserve">    </w:t>
-                            </w:r>
-                            <w:r>
-                              <w:rPr>
-                                <w:rFonts w:ascii="Arial" w:hAnsi="Arial" w:cs="Arial"/>
-                                <w:sz w:val="16"/>
-                                <w:szCs w:val="16"/>
-                              </w:rPr>
-                              <w:t xml:space="preserve">             </w:t>
+                              <w:tab/>
+                            </w:r>
+                            <w:r>
+                              <w:rPr>
+                                <w:rFonts w:ascii="Arial" w:hAnsi="Arial" w:cs="Arial"/>
+                                <w:sz w:val="16"/>
+                                <w:szCs w:val="16"/>
+                              </w:rPr>
+                              <w:t xml:space="preserve">Dont : Humidité</w:t>
                             </w:r>
                           </w:p>
                         </w:txbxContent>
@@ -1401,11 +1391,14 @@
           </mc:Choice>
           <mc:Fallback>
             <w:pict>
-              <v:shape w14:anchorId="22057EC2" id="_x0000_s1035" type="#_x0000_t202" style="position:absolute;left:0;text-align:left;margin-left:-38.45pt;margin-top:352.75pt;width:171.2pt;height:18pt;z-index:251383808;visibility:visible;mso-wrap-style:square;mso-width-percent:0;mso-height-percent:0;mso-wrap-distance-left:9pt;mso-wrap-distance-top:3.6pt;mso-wrap-distance-right:9pt;mso-wrap-distance-bottom:3.6pt;mso-position-horizontal:absolute;mso-position-horizontal-relative:margin;mso-position-vertical:absolute;mso-position-vertical-relative:text;mso-width-percent:0;mso-height-percent:0;mso-width-relative:margin;mso-height-relative:margin;v-text-anchor:top" o:gfxdata="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" filled="f" stroked="f">
+              <v:shape w14:anchorId="22057EC2" id="_x0000_s1035" type="#_x0000_t202" style="position:absolute;left:0;text-align:left;margin-left:-38.45pt;margin-top:353.4pt;width:171.2pt;height:18pt;z-index:251383808;visibility:visible;mso-wrap-style:square;mso-width-percent:0;mso-height-percent:0;mso-wrap-distance-left:9pt;mso-wrap-distance-top:3.6pt;mso-wrap-distance-right:9pt;mso-wrap-distance-bottom:3.6pt;mso-position-horizontal:absolute;mso-position-horizontal-relative:margin;mso-position-vertical:absolute;mso-position-vertical-relative:text;mso-width-percent:0;mso-height-percent:0;mso-width-relative:margin;mso-height-relative:margin;v-text-anchor:top" o:gfxdata="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" filled="f" stroked="f">
                 <v:textbox>
                   <w:txbxContent>
                     <w:p>
                       <w:pPr>
+                        <w:tabs>
+                          <w:tab w:val="right" w:pos="2132"/>
+                        </w:tabs>
                         <w:rPr>
                           <w:rFonts w:ascii="Arial" w:hAnsi="Arial" w:cs="Arial"/>
                           <w:sz w:val="16"/>
@@ -1418,32 +1411,15 @@
                           <w:sz w:val="16"/>
                           <w:szCs w:val="16"/>
                         </w:rPr>
-                        <w:t xml:space="preserve">                       Dont : Humidité</w:t>
-                      </w:r>
-                    </w:p>
-                    <w:p>
-                      <w:pPr>
-                        <w:rPr>
-                          <w:rFonts w:ascii="Arial" w:hAnsi="Arial" w:cs="Arial"/>
-                          <w:sz w:val="16"/>
-                          <w:szCs w:val="16"/>
-                        </w:rPr>
-                      </w:pPr>
-                      <w:r>
-                        <w:rPr>
-                          <w:rFonts w:ascii="Arial" w:hAnsi="Arial" w:cs="Arial"/>
-                          <w:sz w:val="16"/>
-                          <w:szCs w:val="16"/>
-                        </w:rPr>
-                        <w:t xml:space="preserve">    </w:t>
-                      </w:r>
-                      <w:r>
-                        <w:rPr>
-                          <w:rFonts w:ascii="Arial" w:hAnsi="Arial" w:cs="Arial"/>
-                          <w:sz w:val="16"/>
-                          <w:szCs w:val="16"/>
-                        </w:rPr>
-                        <w:t xml:space="preserve">             </w:t>
+                        <w:tab/>
+                      </w:r>
+                      <w:r>
+                        <w:rPr>
+                          <w:rFonts w:ascii="Arial" w:hAnsi="Arial" w:cs="Arial"/>
+                          <w:sz w:val="16"/>
+                          <w:szCs w:val="16"/>
+                        </w:rPr>
+                        <w:t xml:space="preserve">Dont : Humidité</w:t>
                       </w:r>
                     </w:p>
                   </w:txbxContent>
@@ -1621,7 +1597,7 @@
                   <wp:posOffset>-488315</wp:posOffset>
                 </wp:positionH>
                 <wp:positionV relativeFrom="paragraph">
-                  <wp:posOffset>4799965</wp:posOffset>
+                  <wp:posOffset>4831715</wp:posOffset>
                 </wp:positionV>
                 <wp:extent cx="2174240" cy="236220"/>
                 <wp:effectExtent l="0" t="0" r="0" b="0"/>
@@ -1710,7 +1686,7 @@
           </mc:Choice>
           <mc:Fallback>
             <w:pict>
-              <v:shape w14:anchorId="5D5B8DE8" id="_x0000_s1037" type="#_x0000_t202" style="position:absolute;left:0;text-align:left;margin-left:-38.45pt;margin-top:377.95pt;width:171.2pt;height:18.6pt;z-index:251420672;visibility:visible;mso-wrap-style:square;mso-width-percent:0;mso-height-percent:0;mso-wrap-distance-left:9pt;mso-wrap-distance-top:3.6pt;mso-wrap-distance-right:9pt;mso-wrap-distance-bottom:3.6pt;mso-position-horizontal:absolute;mso-position-horizontal-relative:margin;mso-position-vertical:absolute;mso-position-vertical-relative:text;mso-width-percent:0;mso-height-percent:0;mso-width-relative:margin;mso-height-relative:margin;v-text-anchor:top" o:gfxdata="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" filled="f" stroked="f">
+              <v:shape w14:anchorId="5D5B8DE8" id="_x0000_s1037" type="#_x0000_t202" style="position:absolute;left:0;text-align:left;margin-left:-38.45pt;margin-top:380.45pt;width:171.2pt;height:18.6pt;z-index:251420672;visibility:visible;mso-wrap-style:square;mso-width-percent:0;mso-height-percent:0;mso-wrap-distance-left:9pt;mso-wrap-distance-top:3.6pt;mso-wrap-distance-right:9pt;mso-wrap-distance-bottom:3.6pt;mso-position-horizontal:absolute;mso-position-horizontal-relative:margin;mso-position-vertical:absolute;mso-position-vertical-relative:text;mso-width-percent:0;mso-height-percent:0;mso-width-relative:margin;mso-height-relative:margin;v-text-anchor:top" o:gfxdata="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" filled="f" stroked="f">
                 <v:textbox>
                   <w:txbxContent>
                     <w:p>
@@ -1773,7 +1749,7 @@
                   <wp:posOffset>3126105</wp:posOffset>
                 </wp:positionH>
                 <wp:positionV relativeFrom="paragraph">
-                  <wp:posOffset>3119755</wp:posOffset>
+                  <wp:posOffset>3100705</wp:posOffset>
                 </wp:positionV>
                 <wp:extent cx="3050540" cy="266700"/>
                 <wp:effectExtent l="0" t="0" r="0" b="0"/>
@@ -1854,7 +1830,7 @@
           </mc:Choice>
           <mc:Fallback>
             <w:pict>
-              <v:shape w14:anchorId="0B560FCD" id="_x0000_s1038" type="#_x0000_t202" style="position:absolute;left:0;text-align:left;margin-left:246.15pt;margin-top:245.65pt;width:240.2pt;height:21pt;z-index:251318272;visibility:visible;mso-wrap-style:square;mso-width-percent:0;mso-height-percent:0;mso-wrap-distance-left:9pt;mso-wrap-distance-top:3.6pt;mso-wrap-distance-right:9pt;mso-wrap-distance-bottom:3.6pt;mso-position-horizontal:absolute;mso-position-horizontal-relative:margin;mso-position-vertical:absolute;mso-position-vertical-relative:text;mso-width-percent:0;mso-height-percent:0;mso-width-relative:margin;mso-height-relative:margin;v-text-anchor:top" o:gfxdata="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" filled="f" stroked="f">
+              <v:shape w14:anchorId="0B560FCD" id="_x0000_s1038" type="#_x0000_t202" style="position:absolute;left:0;text-align:left;margin-left:246.15pt;margin-top:244.15pt;width:240.2pt;height:21pt;z-index:251318272;visibility:visible;mso-wrap-style:square;mso-width-percent:0;mso-height-percent:0;mso-wrap-distance-left:9pt;mso-wrap-distance-top:3.6pt;mso-wrap-distance-right:9pt;mso-wrap-distance-bottom:3.6pt;mso-position-horizontal:absolute;mso-position-horizontal-relative:margin;mso-position-vertical:absolute;mso-position-vertical-relative:text;mso-width-percent:0;mso-height-percent:0;mso-width-relative:margin;mso-height-relative:margin;v-text-anchor:top" o:gfxdata="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" filled="f" stroked="f">
                 <v:textbox>
                   <w:txbxContent>
                     <w:p>
@@ -1909,7 +1885,7 @@
                   <wp:posOffset>-493395</wp:posOffset>
                 </wp:positionH>
                 <wp:positionV relativeFrom="paragraph">
-                  <wp:posOffset>4643755</wp:posOffset>
+                  <wp:posOffset>4662805</wp:posOffset>
                 </wp:positionV>
                 <wp:extent cx="2174240" cy="196850"/>
                 <wp:effectExtent l="0" t="0" r="0" b="0"/>
@@ -1944,6 +1920,9 @@
                         <w:txbxContent>
                           <w:p>
                             <w:pPr>
+                              <w:tabs>
+                                <w:tab w:val="right" w:pos="2140"/>
+                              </w:tabs>
                               <w:rPr>
                                 <w:rFonts w:ascii="Arial" w:hAnsi="Arial" w:cs="Arial"/>
                                 <w:sz w:val="16"/>
@@ -1956,40 +1935,15 @@
                                 <w:sz w:val="16"/>
                                 <w:szCs w:val="16"/>
                               </w:rPr>
-                              <w:t xml:space="preserve">                       </w:t>
-                            </w:r>
-                            <w:r>
-                              <w:rPr>
-                                <w:rFonts w:ascii="Arial" w:hAnsi="Arial" w:cs="Arial"/>
-                                <w:sz w:val="16"/>
-                                <w:szCs w:val="16"/>
-                              </w:rPr>
-                              <w:t xml:space="preserve">       Autres MC</w:t>
-                            </w:r>
-                          </w:p>
-                          <w:p>
-                            <w:pPr>
-                              <w:rPr>
-                                <w:rFonts w:ascii="Arial" w:hAnsi="Arial" w:cs="Arial"/>
-                                <w:sz w:val="16"/>
-                                <w:szCs w:val="16"/>
-                              </w:rPr>
-                            </w:pPr>
-                            <w:r>
-                              <w:rPr>
-                                <w:rFonts w:ascii="Arial" w:hAnsi="Arial" w:cs="Arial"/>
-                                <w:sz w:val="16"/>
-                                <w:szCs w:val="16"/>
-                              </w:rPr>
-                              <w:t xml:space="preserve">    </w:t>
-                            </w:r>
-                            <w:r>
-                              <w:rPr>
-                                <w:rFonts w:ascii="Arial" w:hAnsi="Arial" w:cs="Arial"/>
-                                <w:sz w:val="16"/>
-                                <w:szCs w:val="16"/>
-                              </w:rPr>
-                              <w:t xml:space="preserve">             </w:t>
+                              <w:tab/>
+                            </w:r>
+                            <w:r>
+                              <w:rPr>
+                                <w:rFonts w:ascii="Arial" w:hAnsi="Arial" w:cs="Arial"/>
+                                <w:sz w:val="16"/>
+                                <w:szCs w:val="16"/>
+                              </w:rPr>
+                              <w:t xml:space="preserve">Autres MC</w:t>
                             </w:r>
                           </w:p>
                         </w:txbxContent>
@@ -2011,11 +1965,14 @@
           </mc:Choice>
           <mc:Fallback>
             <w:pict>
-              <v:shape w14:anchorId="7F03A52A" id="_x0000_s1039" type="#_x0000_t202" style="position:absolute;left:0;text-align:left;margin-left:-38.85pt;margin-top:365.65pt;width:171.2pt;height:15.5pt;z-index:251402240;visibility:visible;mso-wrap-style:square;mso-width-percent:0;mso-height-percent:0;mso-wrap-distance-left:9pt;mso-wrap-distance-top:3.6pt;mso-wrap-distance-right:9pt;mso-wrap-distance-bottom:3.6pt;mso-position-horizontal:absolute;mso-position-horizontal-relative:margin;mso-position-vertical:absolute;mso-position-vertical-relative:text;mso-width-percent:0;mso-height-percent:0;mso-width-relative:margin;mso-height-relative:margin;v-text-anchor:top" o:gfxdata="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" filled="f" stroked="f">
+              <v:shape w14:anchorId="7F03A52A" id="_x0000_s1039" type="#_x0000_t202" style="position:absolute;left:0;text-align:left;margin-left:-38.85pt;margin-top:367.15pt;width:171.2pt;height:15.5pt;z-index:251402240;visibility:visible;mso-wrap-style:square;mso-width-percent:0;mso-height-percent:0;mso-wrap-distance-left:9pt;mso-wrap-distance-top:3.6pt;mso-wrap-distance-right:9pt;mso-wrap-distance-bottom:3.6pt;mso-position-horizontal:absolute;mso-position-horizontal-relative:margin;mso-position-vertical:absolute;mso-position-vertical-relative:text;mso-width-percent:0;mso-height-percent:0;mso-width-relative:margin;mso-height-relative:margin;v-text-anchor:top" o:gfxdata="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" filled="f" stroked="f">
                 <v:textbox>
                   <w:txbxContent>
                     <w:p>
                       <w:pPr>
+                        <w:tabs>
+                          <w:tab w:val="right" w:pos="2140"/>
+                        </w:tabs>
                         <w:rPr>
                           <w:rFonts w:ascii="Arial" w:hAnsi="Arial" w:cs="Arial"/>
                           <w:sz w:val="16"/>
@@ -2028,40 +1985,15 @@
                           <w:sz w:val="16"/>
                           <w:szCs w:val="16"/>
                         </w:rPr>
-                        <w:t xml:space="preserve">                       </w:t>
-                      </w:r>
-                      <w:r>
-                        <w:rPr>
-                          <w:rFonts w:ascii="Arial" w:hAnsi="Arial" w:cs="Arial"/>
-                          <w:sz w:val="16"/>
-                          <w:szCs w:val="16"/>
-                        </w:rPr>
-                        <w:t xml:space="preserve">       Autres MC</w:t>
-                      </w:r>
-                    </w:p>
-                    <w:p>
-                      <w:pPr>
-                        <w:rPr>
-                          <w:rFonts w:ascii="Arial" w:hAnsi="Arial" w:cs="Arial"/>
-                          <w:sz w:val="16"/>
-                          <w:szCs w:val="16"/>
-                        </w:rPr>
-                      </w:pPr>
-                      <w:r>
-                        <w:rPr>
-                          <w:rFonts w:ascii="Arial" w:hAnsi="Arial" w:cs="Arial"/>
-                          <w:sz w:val="16"/>
-                          <w:szCs w:val="16"/>
-                        </w:rPr>
-                        <w:t xml:space="preserve">    </w:t>
-                      </w:r>
-                      <w:r>
-                        <w:rPr>
-                          <w:rFonts w:ascii="Arial" w:hAnsi="Arial" w:cs="Arial"/>
-                          <w:sz w:val="16"/>
-                          <w:szCs w:val="16"/>
-                        </w:rPr>
-                        <w:t xml:space="preserve">             </w:t>
+                        <w:tab/>
+                      </w:r>
+                      <w:r>
+                        <w:rPr>
+                          <w:rFonts w:ascii="Arial" w:hAnsi="Arial" w:cs="Arial"/>
+                          <w:sz w:val="16"/>
+                          <w:szCs w:val="16"/>
+                        </w:rPr>
+                        <w:t xml:space="preserve">Autres MC</w:t>
                       </w:r>
                     </w:p>
                   </w:txbxContent>
@@ -5328,7 +5260,7 @@
                   <wp:posOffset>3449320</wp:posOffset>
                 </wp:positionH>
                 <wp:positionV relativeFrom="paragraph">
-                  <wp:posOffset>6461125</wp:posOffset>
+                  <wp:posOffset>6463030</wp:posOffset>
                 </wp:positionV>
                 <wp:extent cx="1674495" cy="230505"/>
                 <wp:effectExtent l="0" t="0" r="0" b="0"/>
@@ -5417,7 +5349,7 @@
           </mc:Choice>
           <mc:Fallback>
             <w:pict>
-              <v:shape w14:anchorId="13789DB7" id="_x0000_s1060" type="#_x0000_t202" style="position:absolute;left:0;text-align:left;margin-left:271.6pt;margin-top:508.75pt;width:131.85pt;height:18.15pt;z-index:251631616;visibility:visible;mso-wrap-style:square;mso-width-percent:0;mso-height-percent:0;mso-wrap-distance-left:9pt;mso-wrap-distance-top:3.6pt;mso-wrap-distance-right:9pt;mso-wrap-distance-bottom:3.6pt;mso-position-horizontal:absolute;mso-position-horizontal-relative:margin;mso-position-vertical:absolute;mso-position-vertical-relative:text;mso-width-percent:0;mso-height-percent:0;mso-width-relative:margin;mso-height-relative:margin;v-text-anchor:top" o:gfxdata="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" filled="f" stroked="f">
+              <v:shape w14:anchorId="13789DB7" id="_x0000_s1060" type="#_x0000_t202" style="position:absolute;left:0;text-align:left;margin-left:271.6pt;margin-top:508.9pt;width:131.85pt;height:18.15pt;z-index:251631616;visibility:visible;mso-wrap-style:square;mso-width-percent:0;mso-height-percent:0;mso-wrap-distance-left:9pt;mso-wrap-distance-top:3.6pt;mso-wrap-distance-right:9pt;mso-wrap-distance-bottom:3.6pt;mso-position-horizontal:absolute;mso-position-horizontal-relative:margin;mso-position-vertical:absolute;mso-position-vertical-relative:text;mso-width-percent:0;mso-height-percent:0;mso-width-relative:margin;mso-height-relative:margin;v-text-anchor:top" o:gfxdata="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" filled="f" stroked="f">
                 <v:textbox>
                   <w:txbxContent>
                     <w:p>
@@ -5480,7 +5412,7 @@
                   <wp:posOffset>3444240</wp:posOffset>
                 </wp:positionH>
                 <wp:positionV relativeFrom="paragraph">
-                  <wp:posOffset>6624320</wp:posOffset>
+                  <wp:posOffset>6626225</wp:posOffset>
                 </wp:positionV>
                 <wp:extent cx="2174240" cy="230505"/>
                 <wp:effectExtent l="0" t="0" r="0" b="0"/>
@@ -5518,6 +5450,7 @@
                               <w:tabs>
                                 <w:tab w:val="right" w:pos="1715"/>
                               </w:tabs>
+                              <w:ind w:left="9"/>
                               <w:rPr>
                                 <w:rFonts w:ascii="Arial" w:hAnsi="Arial" w:cs="Arial"/>
                                 <w:sz w:val="16"/>
@@ -5561,7 +5494,7 @@
           </mc:Choice>
           <mc:Fallback>
             <w:pict>
-              <v:shape w14:anchorId="67655762" id="_x0000_s1061" type="#_x0000_t202" style="position:absolute;left:0;text-align:left;margin-left:271.2pt;margin-top:521.6pt;width:171.2pt;height:18.15pt;z-index:251641856;visibility:visible;mso-wrap-style:square;mso-width-percent:0;mso-height-percent:0;mso-wrap-distance-left:9pt;mso-wrap-distance-top:3.6pt;mso-wrap-distance-right:9pt;mso-wrap-distance-bottom:3.6pt;mso-position-horizontal:absolute;mso-position-horizontal-relative:margin;mso-position-vertical:absolute;mso-position-vertical-relative:text;mso-width-percent:0;mso-height-percent:0;mso-width-relative:margin;mso-height-relative:margin;v-text-anchor:top" o:gfxdata="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" filled="f" stroked="f">
+              <v:shape w14:anchorId="67655762" id="_x0000_s1061" type="#_x0000_t202" style="position:absolute;left:0;text-align:left;margin-left:271.2pt;margin-top:521.75pt;width:171.2pt;height:18.15pt;z-index:251641856;visibility:visible;mso-wrap-style:square;mso-width-percent:0;mso-height-percent:0;mso-wrap-distance-left:9pt;mso-wrap-distance-top:3.6pt;mso-wrap-distance-right:9pt;mso-wrap-distance-bottom:3.6pt;mso-position-horizontal:absolute;mso-position-horizontal-relative:margin;mso-position-vertical:absolute;mso-position-vertical-relative:text;mso-width-percent:0;mso-height-percent:0;mso-width-relative:margin;mso-height-relative:margin;v-text-anchor:top" o:gfxdata="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" filled="f" stroked="f">
                 <v:textbox>
                   <w:txbxContent>
                     <w:p>
@@ -5569,6 +5502,7 @@
                         <w:tabs>
                           <w:tab w:val="right" w:pos="1715"/>
                         </w:tabs>
+                        <w:ind w:left="9"/>
                         <w:rPr>
                           <w:rFonts w:ascii="Arial" w:hAnsi="Arial" w:cs="Arial"/>
                           <w:sz w:val="16"/>
@@ -5616,7 +5550,7 @@
                   <wp:posOffset>3442335</wp:posOffset>
                 </wp:positionH>
                 <wp:positionV relativeFrom="paragraph">
-                  <wp:posOffset>6778625</wp:posOffset>
+                  <wp:posOffset>6780530</wp:posOffset>
                 </wp:positionV>
                 <wp:extent cx="2174240" cy="230505"/>
                 <wp:effectExtent l="0" t="0" r="0" b="0"/>
@@ -5654,6 +5588,7 @@
                               <w:tabs>
                                 <w:tab w:val="right" w:pos="1718"/>
                               </w:tabs>
+                              <w:ind w:left="12"/>
                               <w:rPr>
                                 <w:rFonts w:ascii="Arial" w:hAnsi="Arial" w:cs="Arial"/>
                                 <w:sz w:val="16"/>
@@ -5697,7 +5632,7 @@
           </mc:Choice>
           <mc:Fallback>
             <w:pict>
-              <v:shape w14:anchorId="747FE65D" id="_x0000_s1062" type="#_x0000_t202" style="position:absolute;left:0;text-align:left;margin-left:271.05pt;margin-top:533.75pt;width:171.2pt;height:18.15pt;z-index:251652096;visibility:visible;mso-wrap-style:square;mso-width-percent:0;mso-height-percent:0;mso-wrap-distance-left:9pt;mso-wrap-distance-top:3.6pt;mso-wrap-distance-right:9pt;mso-wrap-distance-bottom:3.6pt;mso-position-horizontal:absolute;mso-position-horizontal-relative:margin;mso-position-vertical:absolute;mso-position-vertical-relative:text;mso-width-percent:0;mso-height-percent:0;mso-width-relative:margin;mso-height-relative:margin;v-text-anchor:top" o:gfxdata="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" filled="f" stroked="f">
+              <v:shape w14:anchorId="747FE65D" id="_x0000_s1062" type="#_x0000_t202" style="position:absolute;left:0;text-align:left;margin-left:271.05pt;margin-top:533.9pt;width:171.2pt;height:18.15pt;z-index:251652096;visibility:visible;mso-wrap-style:square;mso-width-percent:0;mso-height-percent:0;mso-wrap-distance-left:9pt;mso-wrap-distance-top:3.6pt;mso-wrap-distance-right:9pt;mso-wrap-distance-bottom:3.6pt;mso-position-horizontal:absolute;mso-position-horizontal-relative:margin;mso-position-vertical:absolute;mso-position-vertical-relative:text;mso-width-percent:0;mso-height-percent:0;mso-width-relative:margin;mso-height-relative:margin;v-text-anchor:top" o:gfxdata="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" filled="f" stroked="f">
                 <v:textbox>
                   <w:txbxContent>
                     <w:p>
@@ -5705,6 +5640,7 @@
                         <w:tabs>
                           <w:tab w:val="right" w:pos="1718"/>
                         </w:tabs>
+                        <w:ind w:left="12"/>
                         <w:rPr>
                           <w:rFonts w:ascii="Arial" w:hAnsi="Arial" w:cs="Arial"/>
                           <w:sz w:val="16"/>
@@ -5942,6 +5878,7 @@
                               <w:tabs>
                                 <w:tab w:val="right" w:pos="2473"/>
                               </w:tabs>
+                              <w:ind w:left="12"/>
                               <w:rPr>
                                 <w:rFonts w:ascii="Arial" w:hAnsi="Arial" w:cs="Arial"/>
                                 <w:sz w:val="16"/>
@@ -5993,6 +5930,7 @@
                         <w:tabs>
                           <w:tab w:val="right" w:pos="2473"/>
                         </w:tabs>
+                        <w:ind w:left="12"/>
                         <w:rPr>
                           <w:rFonts w:ascii="Arial" w:hAnsi="Arial" w:cs="Arial"/>
                           <w:sz w:val="16"/>
@@ -6078,6 +6016,7 @@
                               <w:tabs>
                                 <w:tab w:val="right" w:pos="2474"/>
                               </w:tabs>
+                              <w:ind w:left="13"/>
                               <w:rPr>
                                 <w:rFonts w:ascii="Arial" w:hAnsi="Arial" w:cs="Arial"/>
                                 <w:sz w:val="16"/>
@@ -6129,6 +6068,7 @@
                         <w:tabs>
                           <w:tab w:val="right" w:pos="2474"/>
                         </w:tabs>
+                        <w:ind w:left="13"/>
                         <w:rPr>
                           <w:rFonts w:ascii="Arial" w:hAnsi="Arial" w:cs="Arial"/>
                           <w:sz w:val="16"/>
@@ -6176,7 +6116,7 @@
                   <wp:posOffset>1641475</wp:posOffset>
                 </wp:positionH>
                 <wp:positionV relativeFrom="paragraph">
-                  <wp:posOffset>6778625</wp:posOffset>
+                  <wp:posOffset>6780530</wp:posOffset>
                 </wp:positionV>
                 <wp:extent cx="2174240" cy="230505"/>
                 <wp:effectExtent l="0" t="0" r="0" b="0"/>
@@ -6214,6 +6154,7 @@
                               <w:tabs>
                                 <w:tab w:val="right" w:pos="2474"/>
                               </w:tabs>
+                              <w:ind w:left="13"/>
                               <w:rPr>
                                 <w:rFonts w:ascii="Arial" w:hAnsi="Arial" w:cs="Arial"/>
                                 <w:sz w:val="16"/>
@@ -6257,7 +6198,7 @@
           </mc:Choice>
           <mc:Fallback>
             <w:pict>
-              <v:shape w14:anchorId="3A962FD2" id="_x0000_s1066" type="#_x0000_t202" style="position:absolute;left:0;text-align:left;margin-left:129.25pt;margin-top:533.75pt;width:171.2pt;height:18.15pt;z-index:251590656;visibility:visible;mso-wrap-style:square;mso-width-percent:0;mso-height-percent:0;mso-wrap-distance-left:9pt;mso-wrap-distance-top:3.6pt;mso-wrap-distance-right:9pt;mso-wrap-distance-bottom:3.6pt;mso-position-horizontal:absolute;mso-position-horizontal-relative:margin;mso-position-vertical:absolute;mso-position-vertical-relative:text;mso-width-percent:0;mso-height-percent:0;mso-width-relative:margin;mso-height-relative:margin;v-text-anchor:top" o:gfxdata="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" filled="f" stroked="f">
+              <v:shape w14:anchorId="3A962FD2" id="_x0000_s1066" type="#_x0000_t202" style="position:absolute;left:0;text-align:left;margin-left:129.25pt;margin-top:533.9pt;width:171.2pt;height:18.15pt;z-index:251590656;visibility:visible;mso-wrap-style:square;mso-width-percent:0;mso-height-percent:0;mso-wrap-distance-left:9pt;mso-wrap-distance-top:3.6pt;mso-wrap-distance-right:9pt;mso-wrap-distance-bottom:3.6pt;mso-position-horizontal:absolute;mso-position-horizontal-relative:margin;mso-position-vertical:absolute;mso-position-vertical-relative:text;mso-width-percent:0;mso-height-percent:0;mso-width-relative:margin;mso-height-relative:margin;v-text-anchor:top" o:gfxdata="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" filled="f" stroked="f">
                 <v:textbox>
                   <w:txbxContent>
                     <w:p>
@@ -6265,6 +6206,7 @@
                         <w:tabs>
                           <w:tab w:val="right" w:pos="2474"/>
                         </w:tabs>
+                        <w:ind w:left="13"/>
                         <w:rPr>
                           <w:rFonts w:ascii="Arial" w:hAnsi="Arial" w:cs="Arial"/>
                           <w:sz w:val="16"/>
@@ -6312,7 +6254,7 @@
                   <wp:posOffset>1643380</wp:posOffset>
                 </wp:positionH>
                 <wp:positionV relativeFrom="paragraph">
-                  <wp:posOffset>6624320</wp:posOffset>
+                  <wp:posOffset>6626225</wp:posOffset>
                 </wp:positionV>
                 <wp:extent cx="2174240" cy="230505"/>
                 <wp:effectExtent l="0" t="0" r="0" b="0"/>
@@ -6350,6 +6292,7 @@
                               <w:tabs>
                                 <w:tab w:val="right" w:pos="2471"/>
                               </w:tabs>
+                              <w:ind w:left="10"/>
                               <w:rPr>
                                 <w:rFonts w:ascii="Arial" w:hAnsi="Arial" w:cs="Arial"/>
                                 <w:sz w:val="16"/>
@@ -6401,7 +6344,7 @@
           </mc:Choice>
           <mc:Fallback>
             <w:pict>
-              <v:shape w14:anchorId="4BD14C49" id="_x0000_s1067" type="#_x0000_t202" style="position:absolute;left:0;text-align:left;margin-left:129.4pt;margin-top:521.6pt;width:171.2pt;height:18.15pt;z-index:251580416;visibility:visible;mso-wrap-style:square;mso-width-percent:0;mso-height-percent:0;mso-wrap-distance-left:9pt;mso-wrap-distance-top:3.6pt;mso-wrap-distance-right:9pt;mso-wrap-distance-bottom:3.6pt;mso-position-horizontal:absolute;mso-position-horizontal-relative:margin;mso-position-vertical:absolute;mso-position-vertical-relative:text;mso-width-percent:0;mso-height-percent:0;mso-width-relative:margin;mso-height-relative:margin;v-text-anchor:top" o:gfxdata="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" filled="f" stroked="f">
+              <v:shape w14:anchorId="4BD14C49" id="_x0000_s1067" type="#_x0000_t202" style="position:absolute;left:0;text-align:left;margin-left:129.4pt;margin-top:521.75pt;width:171.2pt;height:18.15pt;z-index:251580416;visibility:visible;mso-wrap-style:square;mso-width-percent:0;mso-height-percent:0;mso-wrap-distance-left:9pt;mso-wrap-distance-top:3.6pt;mso-wrap-distance-right:9pt;mso-wrap-distance-bottom:3.6pt;mso-position-horizontal:absolute;mso-position-horizontal-relative:margin;mso-position-vertical:absolute;mso-position-vertical-relative:text;mso-width-percent:0;mso-height-percent:0;mso-width-relative:margin;mso-height-relative:margin;v-text-anchor:top" o:gfxdata="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" filled="f" stroked="f">
                 <v:textbox>
                   <w:txbxContent>
                     <w:p>
@@ -6409,6 +6352,7 @@
                         <w:tabs>
                           <w:tab w:val="right" w:pos="2471"/>
                         </w:tabs>
+                        <w:ind w:left="10"/>
                         <w:rPr>
                           <w:rFonts w:ascii="Arial" w:hAnsi="Arial" w:cs="Arial"/>
                           <w:sz w:val="16"/>
@@ -6464,7 +6408,7 @@
                   <wp:posOffset>1649095</wp:posOffset>
                 </wp:positionH>
                 <wp:positionV relativeFrom="paragraph">
-                  <wp:posOffset>6459220</wp:posOffset>
+                  <wp:posOffset>6461125</wp:posOffset>
                 </wp:positionV>
                 <wp:extent cx="2174240" cy="230505"/>
                 <wp:effectExtent l="0" t="0" r="0" b="0"/>
@@ -6545,7 +6489,7 @@
           </mc:Choice>
           <mc:Fallback>
             <w:pict>
-              <v:shape w14:anchorId="24A32F34" id="_x0000_s1068" type="#_x0000_t202" style="position:absolute;left:0;text-align:left;margin-left:129.85pt;margin-top:508.6pt;width:171.2pt;height:18.15pt;z-index:251570176;visibility:visible;mso-wrap-style:square;mso-width-percent:0;mso-height-percent:0;mso-wrap-distance-left:9pt;mso-wrap-distance-top:3.6pt;mso-wrap-distance-right:9pt;mso-wrap-distance-bottom:3.6pt;mso-position-horizontal:absolute;mso-position-horizontal-relative:margin;mso-position-vertical:absolute;mso-position-vertical-relative:text;mso-width-percent:0;mso-height-percent:0;mso-width-relative:margin;mso-height-relative:margin;v-text-anchor:top" o:gfxdata="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" filled="f" stroked="f">
+              <v:shape w14:anchorId="24A32F34" id="_x0000_s1068" type="#_x0000_t202" style="position:absolute;left:0;text-align:left;margin-left:129.85pt;margin-top:508.75pt;width:171.2pt;height:18.15pt;z-index:251570176;visibility:visible;mso-wrap-style:square;mso-width-percent:0;mso-height-percent:0;mso-wrap-distance-left:9pt;mso-wrap-distance-top:3.6pt;mso-wrap-distance-right:9pt;mso-wrap-distance-bottom:3.6pt;mso-position-horizontal:absolute;mso-position-horizontal-relative:margin;mso-position-vertical:absolute;mso-position-vertical-relative:text;mso-width-percent:0;mso-height-percent:0;mso-width-relative:margin;mso-height-relative:margin;v-text-anchor:top" o:gfxdata="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" filled="f" stroked="f">
                 <v:textbox>
                   <w:txbxContent>
                     <w:p>
@@ -6638,6 +6582,7 @@
                               <w:tabs>
                                 <w:tab w:val="right" w:pos="3074"/>
                               </w:tabs>
+                              <w:ind w:left="4"/>
                               <w:rPr>
                                 <w:rFonts w:ascii="Arial" w:hAnsi="Arial" w:cs="Arial"/>
                                 <w:sz w:val="16"/>
@@ -6689,6 +6634,7 @@
                         <w:tabs>
                           <w:tab w:val="right" w:pos="3074"/>
                         </w:tabs>
+                        <w:ind w:left="4"/>
                         <w:rPr>
                           <w:rFonts w:ascii="Arial" w:hAnsi="Arial" w:cs="Arial"/>
                           <w:sz w:val="16"/>
@@ -6910,6 +6856,7 @@
                               <w:tabs>
                                 <w:tab w:val="right" w:pos="3074"/>
                               </w:tabs>
+                              <w:ind w:left="4"/>
                               <w:rPr>
                                 <w:rFonts w:ascii="Arial" w:hAnsi="Arial" w:cs="Arial"/>
                                 <w:sz w:val="16"/>
@@ -6969,6 +6916,7 @@
                         <w:tabs>
                           <w:tab w:val="right" w:pos="3074"/>
                         </w:tabs>
+                        <w:ind w:left="4"/>
                         <w:rPr>
                           <w:rFonts w:ascii="Arial" w:hAnsi="Arial" w:cs="Arial"/>
                           <w:sz w:val="16"/>
@@ -7024,7 +6972,7 @@
                   <wp:posOffset>-492125</wp:posOffset>
                 </wp:positionH>
                 <wp:positionV relativeFrom="paragraph">
-                  <wp:posOffset>6782435</wp:posOffset>
+                  <wp:posOffset>6780530</wp:posOffset>
                 </wp:positionV>
                 <wp:extent cx="2174240" cy="230505"/>
                 <wp:effectExtent l="0" t="0" r="0" b="0"/>
@@ -7062,6 +7010,7 @@
                               <w:tabs>
                                 <w:tab w:val="right" w:pos="3074"/>
                               </w:tabs>
+                              <w:ind w:left="4"/>
                               <w:rPr>
                                 <w:rFonts w:ascii="Arial" w:hAnsi="Arial" w:cs="Arial"/>
                                 <w:sz w:val="16"/>
@@ -7113,7 +7062,7 @@
           </mc:Choice>
           <mc:Fallback>
             <w:pict>
-              <v:shape w14:anchorId="45980A17" id="_x0000_s1072" type="#_x0000_t202" style="position:absolute;left:0;text-align:left;margin-left:-38.75pt;margin-top:534.05pt;width:171.2pt;height:18.15pt;z-index:251529216;visibility:visible;mso-wrap-style:square;mso-width-percent:0;mso-height-percent:0;mso-wrap-distance-left:9pt;mso-wrap-distance-top:3.6pt;mso-wrap-distance-right:9pt;mso-wrap-distance-bottom:3.6pt;mso-position-horizontal:absolute;mso-position-horizontal-relative:margin;mso-position-vertical:absolute;mso-position-vertical-relative:text;mso-width-percent:0;mso-height-percent:0;mso-width-relative:margin;mso-height-relative:margin;v-text-anchor:top" o:gfxdata="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" filled="f" stroked="f">
+              <v:shape w14:anchorId="45980A17" id="_x0000_s1072" type="#_x0000_t202" style="position:absolute;left:0;text-align:left;margin-left:-38.75pt;margin-top:533.9pt;width:171.2pt;height:18.15pt;z-index:251529216;visibility:visible;mso-wrap-style:square;mso-width-percent:0;mso-height-percent:0;mso-wrap-distance-left:9pt;mso-wrap-distance-top:3.6pt;mso-wrap-distance-right:9pt;mso-wrap-distance-bottom:3.6pt;mso-position-horizontal:absolute;mso-position-horizontal-relative:margin;mso-position-vertical:absolute;mso-position-vertical-relative:text;mso-width-percent:0;mso-height-percent:0;mso-width-relative:margin;mso-height-relative:margin;v-text-anchor:top" o:gfxdata="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" filled="f" stroked="f">
                 <v:textbox>
                   <w:txbxContent>
                     <w:p>
@@ -7121,6 +7070,7 @@
                         <w:tabs>
                           <w:tab w:val="right" w:pos="3074"/>
                         </w:tabs>
+                        <w:ind w:left="4"/>
                         <w:rPr>
                           <w:rFonts w:ascii="Arial" w:hAnsi="Arial" w:cs="Arial"/>
                           <w:sz w:val="16"/>
@@ -7176,7 +7126,7 @@
                   <wp:posOffset>-490220</wp:posOffset>
                 </wp:positionH>
                 <wp:positionV relativeFrom="paragraph">
-                  <wp:posOffset>6628130</wp:posOffset>
+                  <wp:posOffset>6626225</wp:posOffset>
                 </wp:positionV>
                 <wp:extent cx="2174240" cy="230505"/>
                 <wp:effectExtent l="0" t="0" r="0" b="0"/>
@@ -7265,7 +7215,7 @@
           </mc:Choice>
           <mc:Fallback>
             <w:pict>
-              <v:shape w14:anchorId="25D14863" id="_x0000_s1073" type="#_x0000_t202" style="position:absolute;left:0;text-align:left;margin-left:-38.6pt;margin-top:521.9pt;width:171.2pt;height:18.15pt;z-index:251518976;visibility:visible;mso-wrap-style:square;mso-width-percent:0;mso-height-percent:0;mso-wrap-distance-left:9pt;mso-wrap-distance-top:3.6pt;mso-wrap-distance-right:9pt;mso-wrap-distance-bottom:3.6pt;mso-position-horizontal:absolute;mso-position-horizontal-relative:margin;mso-position-vertical:absolute;mso-position-vertical-relative:text;mso-width-percent:0;mso-height-percent:0;mso-width-relative:margin;mso-height-relative:margin;v-text-anchor:top" o:gfxdata="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" filled="f" stroked="f">
+              <v:shape w14:anchorId="25D14863" id="_x0000_s1073" type="#_x0000_t202" style="position:absolute;left:0;text-align:left;margin-left:-38.6pt;margin-top:521.75pt;width:171.2pt;height:18.15pt;z-index:251518976;visibility:visible;mso-wrap-style:square;mso-width-percent:0;mso-height-percent:0;mso-wrap-distance-left:9pt;mso-wrap-distance-top:3.6pt;mso-wrap-distance-right:9pt;mso-wrap-distance-bottom:3.6pt;mso-position-horizontal:absolute;mso-position-horizontal-relative:margin;mso-position-vertical:absolute;mso-position-vertical-relative:text;mso-width-percent:0;mso-height-percent:0;mso-width-relative:margin;mso-height-relative:margin;v-text-anchor:top" o:gfxdata="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" filled="f" stroked="f">
                 <v:textbox>
                   <w:txbxContent>
                     <w:p>
@@ -7328,7 +7278,7 @@
                   <wp:posOffset>-492125</wp:posOffset>
                 </wp:positionH>
                 <wp:positionV relativeFrom="paragraph">
-                  <wp:posOffset>6463094</wp:posOffset>
+                  <wp:posOffset>6461189</wp:posOffset>
                 </wp:positionV>
                 <wp:extent cx="2174240" cy="230505"/>
                 <wp:effectExtent l="0" t="0" r="0" b="0"/>
@@ -7366,6 +7316,7 @@
                               <w:tabs>
                                 <w:tab w:val="right" w:pos="3074"/>
                               </w:tabs>
+                              <w:ind w:left="4"/>
                               <w:rPr>
                                 <w:rFonts w:ascii="Arial" w:hAnsi="Arial" w:cs="Arial"/>
                                 <w:sz w:val="16"/>
@@ -7417,7 +7368,7 @@
           </mc:Choice>
           <mc:Fallback>
             <w:pict>
-              <v:shape w14:anchorId="362D7334" id="_x0000_s1074" type="#_x0000_t202" style="position:absolute;left:0;text-align:left;margin-left:-38.75pt;margin-top:508.9pt;width:171.2pt;height:18.15pt;z-index:251508736;visibility:visible;mso-wrap-style:square;mso-width-percent:0;mso-height-percent:0;mso-wrap-distance-left:9pt;mso-wrap-distance-top:3.6pt;mso-wrap-distance-right:9pt;mso-wrap-distance-bottom:3.6pt;mso-position-horizontal:absolute;mso-position-horizontal-relative:margin;mso-position-vertical:absolute;mso-position-vertical-relative:text;mso-width-percent:0;mso-height-percent:0;mso-width-relative:margin;mso-height-relative:margin;v-text-anchor:top" o:gfxdata="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" filled="f" stroked="f">
+              <v:shape w14:anchorId="362D7334" id="_x0000_s1074" type="#_x0000_t202" style="position:absolute;left:0;text-align:left;margin-left:-38.75pt;margin-top:508.75pt;width:171.2pt;height:18.15pt;z-index:251508736;visibility:visible;mso-wrap-style:square;mso-width-percent:0;mso-height-percent:0;mso-wrap-distance-left:9pt;mso-wrap-distance-top:3.6pt;mso-wrap-distance-right:9pt;mso-wrap-distance-bottom:3.6pt;mso-position-horizontal:absolute;mso-position-horizontal-relative:margin;mso-position-vertical:absolute;mso-position-vertical-relative:text;mso-width-percent:0;mso-height-percent:0;mso-width-relative:margin;mso-height-relative:margin;v-text-anchor:top" o:gfxdata="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" filled="f" stroked="f">
                 <v:textbox>
                   <w:txbxContent>
                     <w:p>
@@ -7425,6 +7376,7 @@
                         <w:tabs>
                           <w:tab w:val="right" w:pos="3074"/>
                         </w:tabs>
+                        <w:ind w:left="4"/>
                         <w:rPr>
                           <w:rFonts w:ascii="Arial" w:hAnsi="Arial" w:cs="Arial"/>
                           <w:sz w:val="16"/>
@@ -7780,6 +7732,7 @@
                               <w:tabs>
                                 <w:tab w:val="right" w:pos="3014"/>
                               </w:tabs>
+                              <w:ind w:left="7"/>
                               <w:rPr>
                                 <w:rFonts w:ascii="Arial" w:hAnsi="Arial" w:cs="Arial"/>
                                 <w:sz w:val="12"/>
@@ -7831,6 +7784,7 @@
                         <w:tabs>
                           <w:tab w:val="right" w:pos="3014"/>
                         </w:tabs>
+                        <w:ind w:left="7"/>
                         <w:rPr>
                           <w:rFonts w:ascii="Arial" w:hAnsi="Arial" w:cs="Arial"/>
                           <w:sz w:val="12"/>
@@ -7916,6 +7870,7 @@
                               <w:tabs>
                                 <w:tab w:val="right" w:pos="3014"/>
                               </w:tabs>
+                              <w:ind w:left="7"/>
                               <w:rPr>
                                 <w:rFonts w:ascii="Arial" w:hAnsi="Arial" w:cs="Arial"/>
                                 <w:sz w:val="12"/>
@@ -7975,6 +7930,7 @@
                         <w:tabs>
                           <w:tab w:val="right" w:pos="3014"/>
                         </w:tabs>
+                        <w:ind w:left="7"/>
                         <w:rPr>
                           <w:rFonts w:ascii="Arial" w:hAnsi="Arial" w:cs="Arial"/>
                           <w:sz w:val="12"/>
@@ -8065,6 +8021,7 @@
                         <w:txbxContent>
                           <w:p>
                             <w:pPr>
+                              <w:ind w:left="975"/>
                               <w:rPr>
                                 <w:rFonts w:ascii="Arial" w:hAnsi="Arial" w:cs="Arial"/>
                                 <w:sz w:val="16"/>
@@ -8077,66 +8034,15 @@
                                 <w:sz w:val="16"/>
                                 <w:szCs w:val="16"/>
                               </w:rPr>
-                              <w:t xml:space="preserve">                      Coupage </w:t>
-                            </w:r>
-                            <w:proofErr w:type="spellStart"/>
-                            <w:r>
-                              <w:rPr>
-                                <w:rFonts w:ascii="Arial" w:hAnsi="Arial" w:cs="Arial"/>
-                                <w:sz w:val="16"/>
-                                <w:szCs w:val="16"/>
-                              </w:rPr>
-                              <w:t>Humid</w:t>
-                            </w:r>
-                            <w:proofErr w:type="spellEnd"/>
-                            <w:r>
-                              <w:rPr>
-                                <w:rFonts w:ascii="Arial" w:hAnsi="Arial" w:cs="Arial"/>
-                                <w:sz w:val="16"/>
-                                <w:szCs w:val="16"/>
-                              </w:rPr>
-                              <w:t xml:space="preserve">       </w:t>
-                            </w:r>
-                            <w:r>
-                              <w:rPr>
-                                <w:rFonts w:ascii="Arial" w:hAnsi="Arial" w:cs="Arial"/>
-                                <w:sz w:val="16"/>
-                                <w:szCs w:val="16"/>
-                              </w:rPr>
-                              <w:t xml:space="preserve"> </w:t>
-                            </w:r>
-                            <w:r>
-                              <w:rPr>
-                                <w:rFonts w:ascii="Arial" w:hAnsi="Arial" w:cs="Arial"/>
-                                <w:sz w:val="16"/>
-                                <w:szCs w:val="16"/>
-                              </w:rPr>
-                              <w:t xml:space="preserve">      </w:t>
-                            </w:r>
-                          </w:p>
-                          <w:p>
-                            <w:pPr>
-                              <w:rPr>
-                                <w:rFonts w:ascii="Arial" w:hAnsi="Arial" w:cs="Arial"/>
-                                <w:sz w:val="16"/>
-                                <w:szCs w:val="16"/>
-                              </w:rPr>
-                            </w:pPr>
-                            <w:r>
-                              <w:rPr>
-                                <w:rFonts w:ascii="Arial" w:hAnsi="Arial" w:cs="Arial"/>
-                                <w:sz w:val="16"/>
-                                <w:szCs w:val="16"/>
-                              </w:rPr>
-                              <w:t xml:space="preserve">    </w:t>
-                            </w:r>
-                            <w:r>
-                              <w:rPr>
-                                <w:rFonts w:ascii="Arial" w:hAnsi="Arial" w:cs="Arial"/>
-                                <w:sz w:val="16"/>
-                                <w:szCs w:val="16"/>
-                              </w:rPr>
-                              <w:t xml:space="preserve">             </w:t>
+                              <w:t xml:space="preserve">Coupage </w:t>
+                            </w:r>
+                            <w:r>
+                              <w:rPr>
+                                <w:rFonts w:ascii="Arial" w:hAnsi="Arial" w:cs="Arial"/>
+                                <w:sz w:val="16"/>
+                                <w:szCs w:val="16"/>
+                              </w:rPr>
+                              <w:t xml:space="preserve">Humid</w:t>
                             </w:r>
                           </w:p>
                         </w:txbxContent>
@@ -8163,6 +8069,7 @@
                   <w:txbxContent>
                     <w:p>
                       <w:pPr>
+                        <w:ind w:left="975"/>
                         <w:rPr>
                           <w:rFonts w:ascii="Arial" w:hAnsi="Arial" w:cs="Arial"/>
                           <w:sz w:val="16"/>
@@ -8175,64 +8082,15 @@
                           <w:sz w:val="16"/>
                           <w:szCs w:val="16"/>
                         </w:rPr>
-                        <w:t xml:space="preserve">                      Coupage </w:t>
-                      </w:r>
-                      <w:r>
-                        <w:rPr>
-                          <w:rFonts w:ascii="Arial" w:hAnsi="Arial" w:cs="Arial"/>
-                          <w:sz w:val="16"/>
-                          <w:szCs w:val="16"/>
-                        </w:rPr>
-                        <w:t>Humid</w:t>
-                      </w:r>
-                      <w:r>
-                        <w:rPr>
-                          <w:rFonts w:ascii="Arial" w:hAnsi="Arial" w:cs="Arial"/>
-                          <w:sz w:val="16"/>
-                          <w:szCs w:val="16"/>
-                        </w:rPr>
-                        <w:t xml:space="preserve">       </w:t>
-                      </w:r>
-                      <w:r>
-                        <w:rPr>
-                          <w:rFonts w:ascii="Arial" w:hAnsi="Arial" w:cs="Arial"/>
-                          <w:sz w:val="16"/>
-                          <w:szCs w:val="16"/>
-                        </w:rPr>
-                        <w:t xml:space="preserve"> </w:t>
-                      </w:r>
-                      <w:r>
-                        <w:rPr>
-                          <w:rFonts w:ascii="Arial" w:hAnsi="Arial" w:cs="Arial"/>
-                          <w:sz w:val="16"/>
-                          <w:szCs w:val="16"/>
-                        </w:rPr>
-                        <w:t xml:space="preserve">      </w:t>
-                      </w:r>
-                    </w:p>
-                    <w:p>
-                      <w:pPr>
-                        <w:rPr>
-                          <w:rFonts w:ascii="Arial" w:hAnsi="Arial" w:cs="Arial"/>
-                          <w:sz w:val="16"/>
-                          <w:szCs w:val="16"/>
-                        </w:rPr>
-                      </w:pPr>
-                      <w:r>
-                        <w:rPr>
-                          <w:rFonts w:ascii="Arial" w:hAnsi="Arial" w:cs="Arial"/>
-                          <w:sz w:val="16"/>
-                          <w:szCs w:val="16"/>
-                        </w:rPr>
-                        <w:t xml:space="preserve">    </w:t>
-                      </w:r>
-                      <w:r>
-                        <w:rPr>
-                          <w:rFonts w:ascii="Arial" w:hAnsi="Arial" w:cs="Arial"/>
-                          <w:sz w:val="16"/>
-                          <w:szCs w:val="16"/>
-                        </w:rPr>
-                        <w:t xml:space="preserve">             </w:t>
+                        <w:t xml:space="preserve">Coupage </w:t>
+                      </w:r>
+                      <w:r>
+                        <w:rPr>
+                          <w:rFonts w:ascii="Arial" w:hAnsi="Arial" w:cs="Arial"/>
+                          <w:sz w:val="16"/>
+                          <w:szCs w:val="16"/>
+                        </w:rPr>
+                        <w:t xml:space="preserve">Humid</w:t>
                       </w:r>
                     </w:p>
                   </w:txbxContent>
@@ -8293,6 +8151,7 @@
                         <w:txbxContent>
                           <w:p>
                             <w:pPr>
+                              <w:ind w:left="963"/>
                               <w:rPr>
                                 <w:rFonts w:ascii="Arial" w:hAnsi="Arial" w:cs="Arial"/>
                                 <w:sz w:val="16"/>
@@ -8305,7 +8164,7 @@
                                 <w:sz w:val="16"/>
                                 <w:szCs w:val="16"/>
                               </w:rPr>
-                              <w:t xml:space="preserve">                      Coupage </w:t>
+                              <w:t xml:space="preserve">Coupage </w:t>
                             </w:r>
                             <w:r>
                               <w:rPr>
@@ -8315,48 +8174,13 @@
                               </w:rPr>
                               <w:t xml:space="preserve">mat. </w:t>
                             </w:r>
-                            <w:proofErr w:type="spellStart"/>
-                            <w:r>
-                              <w:rPr>
-                                <w:rFonts w:ascii="Arial" w:hAnsi="Arial" w:cs="Arial"/>
-                                <w:sz w:val="16"/>
-                                <w:szCs w:val="16"/>
-                              </w:rPr>
-                              <w:t>etr</w:t>
-                            </w:r>
-                            <w:proofErr w:type="spellEnd"/>
-                            <w:r>
-                              <w:rPr>
-                                <w:rFonts w:ascii="Arial" w:hAnsi="Arial" w:cs="Arial"/>
-                                <w:sz w:val="16"/>
-                                <w:szCs w:val="16"/>
-                              </w:rPr>
-                              <w:t xml:space="preserve">            </w:t>
-                            </w:r>
-                          </w:p>
-                          <w:p>
-                            <w:pPr>
-                              <w:rPr>
-                                <w:rFonts w:ascii="Arial" w:hAnsi="Arial" w:cs="Arial"/>
-                                <w:sz w:val="16"/>
-                                <w:szCs w:val="16"/>
-                              </w:rPr>
-                            </w:pPr>
-                            <w:r>
-                              <w:rPr>
-                                <w:rFonts w:ascii="Arial" w:hAnsi="Arial" w:cs="Arial"/>
-                                <w:sz w:val="16"/>
-                                <w:szCs w:val="16"/>
-                              </w:rPr>
-                              <w:t xml:space="preserve">    </w:t>
-                            </w:r>
-                            <w:r>
-                              <w:rPr>
-                                <w:rFonts w:ascii="Arial" w:hAnsi="Arial" w:cs="Arial"/>
-                                <w:sz w:val="16"/>
-                                <w:szCs w:val="16"/>
-                              </w:rPr>
-                              <w:t xml:space="preserve">             </w:t>
+                            <w:r>
+                              <w:rPr>
+                                <w:rFonts w:ascii="Arial" w:hAnsi="Arial" w:cs="Arial"/>
+                                <w:sz w:val="16"/>
+                                <w:szCs w:val="16"/>
+                              </w:rPr>
+                              <w:t xml:space="preserve">etr</w:t>
                             </w:r>
                           </w:p>
                         </w:txbxContent>
@@ -8383,6 +8207,7 @@
                   <w:txbxContent>
                     <w:p>
                       <w:pPr>
+                        <w:ind w:left="963"/>
                         <w:rPr>
                           <w:rFonts w:ascii="Arial" w:hAnsi="Arial" w:cs="Arial"/>
                           <w:sz w:val="16"/>
@@ -8395,48 +8220,23 @@
                           <w:sz w:val="16"/>
                           <w:szCs w:val="16"/>
                         </w:rPr>
-                        <w:t xml:space="preserve">                      Coupage </w:t>
-                      </w:r>
-                      <w:r>
-                        <w:rPr>
-                          <w:rFonts w:ascii="Arial" w:hAnsi="Arial" w:cs="Arial"/>
-                          <w:sz w:val="16"/>
-                          <w:szCs w:val="16"/>
-                        </w:rPr>
-                        <w:t>mat. etr</w:t>
-                      </w:r>
-                      <w:r>
-                        <w:rPr>
-                          <w:rFonts w:ascii="Arial" w:hAnsi="Arial" w:cs="Arial"/>
-                          <w:sz w:val="16"/>
-                          <w:szCs w:val="16"/>
-                        </w:rPr>
-                        <w:t xml:space="preserve">            </w:t>
-                      </w:r>
-                    </w:p>
-                    <w:p>
-                      <w:pPr>
-                        <w:rPr>
-                          <w:rFonts w:ascii="Arial" w:hAnsi="Arial" w:cs="Arial"/>
-                          <w:sz w:val="16"/>
-                          <w:szCs w:val="16"/>
-                        </w:rPr>
-                      </w:pPr>
-                      <w:r>
-                        <w:rPr>
-                          <w:rFonts w:ascii="Arial" w:hAnsi="Arial" w:cs="Arial"/>
-                          <w:sz w:val="16"/>
-                          <w:szCs w:val="16"/>
-                        </w:rPr>
-                        <w:t xml:space="preserve">    </w:t>
-                      </w:r>
-                      <w:r>
-                        <w:rPr>
-                          <w:rFonts w:ascii="Arial" w:hAnsi="Arial" w:cs="Arial"/>
-                          <w:sz w:val="16"/>
-                          <w:szCs w:val="16"/>
-                        </w:rPr>
-                        <w:t xml:space="preserve">             </w:t>
+                        <w:t xml:space="preserve">Coupage </w:t>
+                      </w:r>
+                      <w:r>
+                        <w:rPr>
+                          <w:rFonts w:ascii="Arial" w:hAnsi="Arial" w:cs="Arial"/>
+                          <w:sz w:val="16"/>
+                          <w:szCs w:val="16"/>
+                        </w:rPr>
+                        <w:t xml:space="preserve">mat. </w:t>
+                      </w:r>
+                      <w:r>
+                        <w:rPr>
+                          <w:rFonts w:ascii="Arial" w:hAnsi="Arial" w:cs="Arial"/>
+                          <w:sz w:val="16"/>
+                          <w:szCs w:val="16"/>
+                        </w:rPr>
+                        <w:t xml:space="preserve">etr</w:t>
                       </w:r>
                     </w:p>
                   </w:txbxContent>
@@ -8497,6 +8297,7 @@
                         <w:txbxContent>
                           <w:p>
                             <w:pPr>
+                              <w:ind w:left="962"/>
                               <w:rPr>
                                 <w:rFonts w:ascii="Arial" w:hAnsi="Arial" w:cs="Arial"/>
                                 <w:sz w:val="16"/>
@@ -8509,64 +8310,31 @@
                                 <w:sz w:val="16"/>
                                 <w:szCs w:val="16"/>
                               </w:rPr>
-                              <w:t xml:space="preserve">                      Coupage </w:t>
-                            </w:r>
-                            <w:r>
-                              <w:rPr>
-                                <w:rFonts w:ascii="Arial" w:hAnsi="Arial" w:cs="Arial"/>
-                                <w:sz w:val="16"/>
-                                <w:szCs w:val="16"/>
-                              </w:rPr>
-                              <w:t>B</w:t>
-                            </w:r>
-                            <w:r>
-                              <w:rPr>
-                                <w:rFonts w:ascii="Arial" w:hAnsi="Arial" w:cs="Arial"/>
-                                <w:sz w:val="16"/>
-                                <w:szCs w:val="16"/>
-                              </w:rPr>
-                              <w:t>ris</w:t>
-                            </w:r>
-                            <w:r>
-                              <w:rPr>
-                                <w:rFonts w:ascii="Arial" w:hAnsi="Arial" w:cs="Arial"/>
-                                <w:sz w:val="16"/>
-                                <w:szCs w:val="16"/>
-                              </w:rPr>
-                              <w:t xml:space="preserve">ure             </w:t>
-                            </w:r>
-                            <w:r>
-                              <w:rPr>
-                                <w:rFonts w:ascii="Arial" w:hAnsi="Arial" w:cs="Arial"/>
-                                <w:sz w:val="16"/>
-                                <w:szCs w:val="16"/>
-                              </w:rPr>
-                              <w:t xml:space="preserve">            </w:t>
-                            </w:r>
-                          </w:p>
-                          <w:p>
-                            <w:pPr>
-                              <w:rPr>
-                                <w:rFonts w:ascii="Arial" w:hAnsi="Arial" w:cs="Arial"/>
-                                <w:sz w:val="16"/>
-                                <w:szCs w:val="16"/>
-                              </w:rPr>
-                            </w:pPr>
-                            <w:r>
-                              <w:rPr>
-                                <w:rFonts w:ascii="Arial" w:hAnsi="Arial" w:cs="Arial"/>
-                                <w:sz w:val="16"/>
-                                <w:szCs w:val="16"/>
-                              </w:rPr>
-                              <w:t xml:space="preserve">    </w:t>
-                            </w:r>
-                            <w:r>
-                              <w:rPr>
-                                <w:rFonts w:ascii="Arial" w:hAnsi="Arial" w:cs="Arial"/>
-                                <w:sz w:val="16"/>
-                                <w:szCs w:val="16"/>
-                              </w:rPr>
-                              <w:t xml:space="preserve">             </w:t>
+                              <w:t xml:space="preserve">Coupage </w:t>
+                            </w:r>
+                            <w:r>
+                              <w:rPr>
+                                <w:rFonts w:ascii="Arial" w:hAnsi="Arial" w:cs="Arial"/>
+                                <w:sz w:val="16"/>
+                                <w:szCs w:val="16"/>
+                              </w:rPr>
+                              <w:t xml:space="preserve">B</w:t>
+                            </w:r>
+                            <w:r>
+                              <w:rPr>
+                                <w:rFonts w:ascii="Arial" w:hAnsi="Arial" w:cs="Arial"/>
+                                <w:sz w:val="16"/>
+                                <w:szCs w:val="16"/>
+                              </w:rPr>
+                              <w:t xml:space="preserve">ris</w:t>
+                            </w:r>
+                            <w:r>
+                              <w:rPr>
+                                <w:rFonts w:ascii="Arial" w:hAnsi="Arial" w:cs="Arial"/>
+                                <w:sz w:val="16"/>
+                                <w:szCs w:val="16"/>
+                              </w:rPr>
+                              <w:t xml:space="preserve">ure</w:t>
                             </w:r>
                           </w:p>
                         </w:txbxContent>
@@ -8593,6 +8361,7 @@
                   <w:txbxContent>
                     <w:p>
                       <w:pPr>
+                        <w:ind w:left="962"/>
                         <w:rPr>
                           <w:rFonts w:ascii="Arial" w:hAnsi="Arial" w:cs="Arial"/>
                           <w:sz w:val="16"/>
@@ -8605,64 +8374,31 @@
                           <w:sz w:val="16"/>
                           <w:szCs w:val="16"/>
                         </w:rPr>
-                        <w:t xml:space="preserve">                      Coupage </w:t>
-                      </w:r>
-                      <w:r>
-                        <w:rPr>
-                          <w:rFonts w:ascii="Arial" w:hAnsi="Arial" w:cs="Arial"/>
-                          <w:sz w:val="16"/>
-                          <w:szCs w:val="16"/>
-                        </w:rPr>
-                        <w:t>B</w:t>
-                      </w:r>
-                      <w:r>
-                        <w:rPr>
-                          <w:rFonts w:ascii="Arial" w:hAnsi="Arial" w:cs="Arial"/>
-                          <w:sz w:val="16"/>
-                          <w:szCs w:val="16"/>
-                        </w:rPr>
-                        <w:t>ris</w:t>
-                      </w:r>
-                      <w:r>
-                        <w:rPr>
-                          <w:rFonts w:ascii="Arial" w:hAnsi="Arial" w:cs="Arial"/>
-                          <w:sz w:val="16"/>
-                          <w:szCs w:val="16"/>
-                        </w:rPr>
-                        <w:t xml:space="preserve">ure             </w:t>
-                      </w:r>
-                      <w:r>
-                        <w:rPr>
-                          <w:rFonts w:ascii="Arial" w:hAnsi="Arial" w:cs="Arial"/>
-                          <w:sz w:val="16"/>
-                          <w:szCs w:val="16"/>
-                        </w:rPr>
-                        <w:t xml:space="preserve">            </w:t>
-                      </w:r>
-                    </w:p>
-                    <w:p>
-                      <w:pPr>
-                        <w:rPr>
-                          <w:rFonts w:ascii="Arial" w:hAnsi="Arial" w:cs="Arial"/>
-                          <w:sz w:val="16"/>
-                          <w:szCs w:val="16"/>
-                        </w:rPr>
-                      </w:pPr>
-                      <w:r>
-                        <w:rPr>
-                          <w:rFonts w:ascii="Arial" w:hAnsi="Arial" w:cs="Arial"/>
-                          <w:sz w:val="16"/>
-                          <w:szCs w:val="16"/>
-                        </w:rPr>
-                        <w:t xml:space="preserve">    </w:t>
-                      </w:r>
-                      <w:r>
-                        <w:rPr>
-                          <w:rFonts w:ascii="Arial" w:hAnsi="Arial" w:cs="Arial"/>
-                          <w:sz w:val="16"/>
-                          <w:szCs w:val="16"/>
-                        </w:rPr>
-                        <w:t xml:space="preserve">             </w:t>
+                        <w:t xml:space="preserve">Coupage </w:t>
+                      </w:r>
+                      <w:r>
+                        <w:rPr>
+                          <w:rFonts w:ascii="Arial" w:hAnsi="Arial" w:cs="Arial"/>
+                          <w:sz w:val="16"/>
+                          <w:szCs w:val="16"/>
+                        </w:rPr>
+                        <w:t xml:space="preserve">B</w:t>
+                      </w:r>
+                      <w:r>
+                        <w:rPr>
+                          <w:rFonts w:ascii="Arial" w:hAnsi="Arial" w:cs="Arial"/>
+                          <w:sz w:val="16"/>
+                          <w:szCs w:val="16"/>
+                        </w:rPr>
+                        <w:t xml:space="preserve">ris</w:t>
+                      </w:r>
+                      <w:r>
+                        <w:rPr>
+                          <w:rFonts w:ascii="Arial" w:hAnsi="Arial" w:cs="Arial"/>
+                          <w:sz w:val="16"/>
+                          <w:szCs w:val="16"/>
+                        </w:rPr>
+                        <w:t xml:space="preserve">ure</w:t>
                       </w:r>
                     </w:p>
                   </w:txbxContent>
@@ -8723,6 +8459,7 @@
                         <w:txbxContent>
                           <w:p>
                             <w:pPr>
+                              <w:ind w:left="963"/>
                               <w:rPr>
                                 <w:rFonts w:ascii="Arial" w:hAnsi="Arial" w:cs="Arial"/>
                                 <w:sz w:val="16"/>
@@ -8735,48 +8472,23 @@
                                 <w:sz w:val="16"/>
                                 <w:szCs w:val="16"/>
                               </w:rPr>
-                              <w:t xml:space="preserve">                      Coupage </w:t>
-                            </w:r>
-                            <w:r>
-                              <w:rPr>
-                                <w:rFonts w:ascii="Arial" w:hAnsi="Arial" w:cs="Arial"/>
-                                <w:sz w:val="16"/>
-                                <w:szCs w:val="16"/>
-                              </w:rPr>
-                              <w:t>D</w:t>
-                            </w:r>
-                            <w:r>
-                              <w:rPr>
-                                <w:rFonts w:ascii="Arial" w:hAnsi="Arial" w:cs="Arial"/>
-                                <w:sz w:val="16"/>
-                                <w:szCs w:val="16"/>
-                              </w:rPr>
-                              <w:t xml:space="preserve">échet                         </w:t>
-                            </w:r>
-                          </w:p>
-                          <w:p>
-                            <w:pPr>
-                              <w:rPr>
-                                <w:rFonts w:ascii="Arial" w:hAnsi="Arial" w:cs="Arial"/>
-                                <w:sz w:val="16"/>
-                                <w:szCs w:val="16"/>
-                              </w:rPr>
-                            </w:pPr>
-                            <w:r>
-                              <w:rPr>
-                                <w:rFonts w:ascii="Arial" w:hAnsi="Arial" w:cs="Arial"/>
-                                <w:sz w:val="16"/>
-                                <w:szCs w:val="16"/>
-                              </w:rPr>
-                              <w:t xml:space="preserve">    </w:t>
-                            </w:r>
-                            <w:r>
-                              <w:rPr>
-                                <w:rFonts w:ascii="Arial" w:hAnsi="Arial" w:cs="Arial"/>
-                                <w:sz w:val="16"/>
-                                <w:szCs w:val="16"/>
-                              </w:rPr>
-                              <w:t xml:space="preserve">             </w:t>
+                              <w:t xml:space="preserve">Coupage </w:t>
+                            </w:r>
+                            <w:r>
+                              <w:rPr>
+                                <w:rFonts w:ascii="Arial" w:hAnsi="Arial" w:cs="Arial"/>
+                                <w:sz w:val="16"/>
+                                <w:szCs w:val="16"/>
+                              </w:rPr>
+                              <w:t xml:space="preserve">D</w:t>
+                            </w:r>
+                            <w:r>
+                              <w:rPr>
+                                <w:rFonts w:ascii="Arial" w:hAnsi="Arial" w:cs="Arial"/>
+                                <w:sz w:val="16"/>
+                                <w:szCs w:val="16"/>
+                              </w:rPr>
+                              <w:t xml:space="preserve">échet</w:t>
                             </w:r>
                           </w:p>
                         </w:txbxContent>
@@ -8803,6 +8515,7 @@
                   <w:txbxContent>
                     <w:p>
                       <w:pPr>
+                        <w:ind w:left="963"/>
                         <w:rPr>
                           <w:rFonts w:ascii="Arial" w:hAnsi="Arial" w:cs="Arial"/>
                           <w:sz w:val="16"/>
@@ -8815,48 +8528,23 @@
                           <w:sz w:val="16"/>
                           <w:szCs w:val="16"/>
                         </w:rPr>
-                        <w:t xml:space="preserve">                      Coupage </w:t>
-                      </w:r>
-                      <w:r>
-                        <w:rPr>
-                          <w:rFonts w:ascii="Arial" w:hAnsi="Arial" w:cs="Arial"/>
-                          <w:sz w:val="16"/>
-                          <w:szCs w:val="16"/>
-                        </w:rPr>
-                        <w:t>D</w:t>
-                      </w:r>
-                      <w:r>
-                        <w:rPr>
-                          <w:rFonts w:ascii="Arial" w:hAnsi="Arial" w:cs="Arial"/>
-                          <w:sz w:val="16"/>
-                          <w:szCs w:val="16"/>
-                        </w:rPr>
-                        <w:t xml:space="preserve">échet                         </w:t>
-                      </w:r>
-                    </w:p>
-                    <w:p>
-                      <w:pPr>
-                        <w:rPr>
-                          <w:rFonts w:ascii="Arial" w:hAnsi="Arial" w:cs="Arial"/>
-                          <w:sz w:val="16"/>
-                          <w:szCs w:val="16"/>
-                        </w:rPr>
-                      </w:pPr>
-                      <w:r>
-                        <w:rPr>
-                          <w:rFonts w:ascii="Arial" w:hAnsi="Arial" w:cs="Arial"/>
-                          <w:sz w:val="16"/>
-                          <w:szCs w:val="16"/>
-                        </w:rPr>
-                        <w:t xml:space="preserve">    </w:t>
-                      </w:r>
-                      <w:r>
-                        <w:rPr>
-                          <w:rFonts w:ascii="Arial" w:hAnsi="Arial" w:cs="Arial"/>
-                          <w:sz w:val="16"/>
-                          <w:szCs w:val="16"/>
-                        </w:rPr>
-                        <w:t xml:space="preserve">             </w:t>
+                        <w:t xml:space="preserve">Coupage </w:t>
+                      </w:r>
+                      <w:r>
+                        <w:rPr>
+                          <w:rFonts w:ascii="Arial" w:hAnsi="Arial" w:cs="Arial"/>
+                          <w:sz w:val="16"/>
+                          <w:szCs w:val="16"/>
+                        </w:rPr>
+                        <w:t xml:space="preserve">D</w:t>
+                      </w:r>
+                      <w:r>
+                        <w:rPr>
+                          <w:rFonts w:ascii="Arial" w:hAnsi="Arial" w:cs="Arial"/>
+                          <w:sz w:val="16"/>
+                          <w:szCs w:val="16"/>
+                        </w:rPr>
+                        <w:t xml:space="preserve">échet</w:t>
                       </w:r>
                     </w:p>
                   </w:txbxContent>
@@ -8920,7 +8608,7 @@
                               <w:tabs>
                                 <w:tab w:val="right" w:pos="3001"/>
                               </w:tabs>
-                              <w:ind w:left="981"/>
+                              <w:ind w:left="962"/>
                               <w:rPr>
                                 <w:rFonts w:ascii="Arial" w:hAnsi="Arial" w:cs="Arial"/>
                                 <w:b/>
@@ -8976,7 +8664,7 @@
                         <w:tabs>
                           <w:tab w:val="right" w:pos="3001"/>
                         </w:tabs>
-                        <w:ind w:left="981"/>
+                        <w:ind w:left="962"/>
                         <w:rPr>
                           <w:rFonts w:ascii="Arial" w:hAnsi="Arial" w:cs="Arial"/>
                           <w:b/>
@@ -9028,7 +8716,7 @@
                   <wp:posOffset>2235835</wp:posOffset>
                 </wp:positionH>
                 <wp:positionV relativeFrom="paragraph">
-                  <wp:posOffset>4497070</wp:posOffset>
+                  <wp:posOffset>4488815</wp:posOffset>
                 </wp:positionV>
                 <wp:extent cx="2174240" cy="230505"/>
                 <wp:effectExtent l="0" t="0" r="0" b="0"/>
@@ -9066,6 +8754,7 @@
                               <w:tabs>
                                 <w:tab w:val="right" w:pos="2878"/>
                               </w:tabs>
+                              <w:ind w:left="24"/>
                               <w:rPr>
                                 <w:rFonts w:ascii="Arial" w:hAnsi="Arial" w:cs="Arial"/>
                                 <w:sz w:val="12"/>
@@ -9125,7 +8814,7 @@
           </mc:Choice>
           <mc:Fallback>
             <w:pict>
-              <v:shape w14:anchorId="0F74DCEA" id="_x0000_s1084" type="#_x0000_t202" style="position:absolute;left:0;text-align:left;margin-left:176.05pt;margin-top:354.1pt;width:171.2pt;height:18.15pt;z-index:251478016;visibility:visible;mso-wrap-style:square;mso-width-percent:0;mso-height-percent:0;mso-wrap-distance-left:9pt;mso-wrap-distance-top:3.6pt;mso-wrap-distance-right:9pt;mso-wrap-distance-bottom:3.6pt;mso-position-horizontal:absolute;mso-position-horizontal-relative:margin;mso-position-vertical:absolute;mso-position-vertical-relative:text;mso-width-percent:0;mso-height-percent:0;mso-width-relative:margin;mso-height-relative:margin;v-text-anchor:top" o:gfxdata="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" filled="f" stroked="f">
+              <v:shape w14:anchorId="0F74DCEA" id="_x0000_s1084" type="#_x0000_t202" style="position:absolute;left:0;text-align:left;margin-left:176.05pt;margin-top:353.45pt;width:171.2pt;height:18.15pt;z-index:251478016;visibility:visible;mso-wrap-style:square;mso-width-percent:0;mso-height-percent:0;mso-wrap-distance-left:9pt;mso-wrap-distance-top:3.6pt;mso-wrap-distance-right:9pt;mso-wrap-distance-bottom:3.6pt;mso-position-horizontal:absolute;mso-position-horizontal-relative:margin;mso-position-vertical:absolute;mso-position-vertical-relative:text;mso-width-percent:0;mso-height-percent:0;mso-width-relative:margin;mso-height-relative:margin;v-text-anchor:top" o:gfxdata="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" filled="f" stroked="f">
                 <v:textbox>
                   <w:txbxContent>
                     <w:p>
@@ -9133,6 +8822,7 @@
                         <w:tabs>
                           <w:tab w:val="right" w:pos="2878"/>
                         </w:tabs>
+                        <w:ind w:left="24"/>
                         <w:rPr>
                           <w:rFonts w:ascii="Arial" w:hAnsi="Arial" w:cs="Arial"/>
                           <w:sz w:val="12"/>
@@ -9196,7 +8886,7 @@
                   <wp:posOffset>2247265</wp:posOffset>
                 </wp:positionH>
                 <wp:positionV relativeFrom="paragraph">
-                  <wp:posOffset>4681855</wp:posOffset>
+                  <wp:posOffset>4662805</wp:posOffset>
                 </wp:positionV>
                 <wp:extent cx="2174240" cy="230505"/>
                 <wp:effectExtent l="0" t="0" r="0" b="0"/>
@@ -9234,6 +8924,7 @@
                               <w:tabs>
                                 <w:tab w:val="right" w:pos="2860"/>
                               </w:tabs>
+                              <w:ind w:left="6"/>
                               <w:rPr>
                                 <w:rFonts w:ascii="Arial" w:hAnsi="Arial" w:cs="Arial"/>
                                 <w:sz w:val="16"/>
@@ -9277,7 +8968,7 @@
           </mc:Choice>
           <mc:Fallback>
             <w:pict>
-              <v:shape w14:anchorId="2DA552E0" id="_x0000_s1085" type="#_x0000_t202" style="position:absolute;left:0;text-align:left;margin-left:176.95pt;margin-top:368.65pt;width:171.2pt;height:18.15pt;z-index:251480064;visibility:visible;mso-wrap-style:square;mso-width-percent:0;mso-height-percent:0;mso-wrap-distance-left:9pt;mso-wrap-distance-top:3.6pt;mso-wrap-distance-right:9pt;mso-wrap-distance-bottom:3.6pt;mso-position-horizontal:absolute;mso-position-horizontal-relative:margin;mso-position-vertical:absolute;mso-position-vertical-relative:text;mso-width-percent:0;mso-height-percent:0;mso-width-relative:margin;mso-height-relative:margin;v-text-anchor:top" o:gfxdata="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" filled="f" stroked="f">
+              <v:shape w14:anchorId="2DA552E0" id="_x0000_s1085" type="#_x0000_t202" style="position:absolute;left:0;text-align:left;margin-left:176.95pt;margin-top:367.15pt;width:171.2pt;height:18.15pt;z-index:251480064;visibility:visible;mso-wrap-style:square;mso-width-percent:0;mso-height-percent:0;mso-wrap-distance-left:9pt;mso-wrap-distance-top:3.6pt;mso-wrap-distance-right:9pt;mso-wrap-distance-bottom:3.6pt;mso-position-horizontal:absolute;mso-position-horizontal-relative:margin;mso-position-vertical:absolute;mso-position-vertical-relative:text;mso-width-percent:0;mso-height-percent:0;mso-width-relative:margin;mso-height-relative:margin;v-text-anchor:top" o:gfxdata="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" filled="f" stroked="f">
                 <v:textbox>
                   <w:txbxContent>
                     <w:p>
@@ -9285,6 +8976,7 @@
                         <w:tabs>
                           <w:tab w:val="right" w:pos="2860"/>
                         </w:tabs>
+                        <w:ind w:left="6"/>
                         <w:rPr>
                           <w:rFonts w:ascii="Arial" w:hAnsi="Arial" w:cs="Arial"/>
                           <w:sz w:val="16"/>
@@ -9332,7 +9024,7 @@
                   <wp:posOffset>2247265</wp:posOffset>
                 </wp:positionH>
                 <wp:positionV relativeFrom="paragraph">
-                  <wp:posOffset>4866005</wp:posOffset>
+                  <wp:posOffset>4834255</wp:posOffset>
                 </wp:positionV>
                 <wp:extent cx="2174240" cy="230505"/>
                 <wp:effectExtent l="0" t="0" r="0" b="0"/>
@@ -9370,6 +9062,7 @@
                               <w:tabs>
                                 <w:tab w:val="right" w:pos="2860"/>
                               </w:tabs>
+                              <w:ind w:left="6"/>
                               <w:rPr>
                                 <w:rFonts w:ascii="Arial" w:hAnsi="Arial" w:cs="Arial"/>
                                 <w:sz w:val="12"/>
@@ -9413,7 +9106,7 @@
           </mc:Choice>
           <mc:Fallback>
             <w:pict>
-              <v:shape w14:anchorId="7499C928" id="_x0000_s1086" type="#_x0000_t202" style="position:absolute;left:0;text-align:left;margin-left:176.95pt;margin-top:383.15pt;width:171.2pt;height:18.15pt;z-index:251482112;visibility:visible;mso-wrap-style:square;mso-width-percent:0;mso-height-percent:0;mso-wrap-distance-left:9pt;mso-wrap-distance-top:3.6pt;mso-wrap-distance-right:9pt;mso-wrap-distance-bottom:3.6pt;mso-position-horizontal:absolute;mso-position-horizontal-relative:margin;mso-position-vertical:absolute;mso-position-vertical-relative:text;mso-width-percent:0;mso-height-percent:0;mso-width-relative:margin;mso-height-relative:margin;v-text-anchor:top" o:gfxdata="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" filled="f" stroked="f">
+              <v:shape w14:anchorId="7499C928" id="_x0000_s1086" type="#_x0000_t202" style="position:absolute;left:0;text-align:left;margin-left:176.95pt;margin-top:380.65pt;width:171.2pt;height:18.15pt;z-index:251482112;visibility:visible;mso-wrap-style:square;mso-width-percent:0;mso-height-percent:0;mso-wrap-distance-left:9pt;mso-wrap-distance-top:3.6pt;mso-wrap-distance-right:9pt;mso-wrap-distance-bottom:3.6pt;mso-position-horizontal:absolute;mso-position-horizontal-relative:margin;mso-position-vertical:absolute;mso-position-vertical-relative:text;mso-width-percent:0;mso-height-percent:0;mso-width-relative:margin;mso-height-relative:margin;v-text-anchor:top" o:gfxdata="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" filled="f" stroked="f">
                 <v:textbox>
                   <w:txbxContent>
                     <w:p>
@@ -9421,6 +9114,7 @@
                         <w:tabs>
                           <w:tab w:val="right" w:pos="2860"/>
                         </w:tabs>
+                        <w:ind w:left="6"/>
                         <w:rPr>
                           <w:rFonts w:ascii="Arial" w:hAnsi="Arial" w:cs="Arial"/>
                           <w:sz w:val="12"/>
@@ -9506,7 +9200,7 @@
                               <w:tabs>
                                 <w:tab w:val="left" w:pos="1628"/>
                               </w:tabs>
-                              <w:ind w:left="48"/>
+                              <w:ind w:left="49"/>
                               <w:rPr>
                                 <w:rFonts w:ascii="Arial" w:hAnsi="Arial" w:cs="Arial"/>
                                 <w:sz w:val="12"/>
@@ -9566,7 +9260,7 @@
                         <w:tabs>
                           <w:tab w:val="left" w:pos="1628"/>
                         </w:tabs>
-                        <w:ind w:left="48"/>
+                        <w:ind w:left="49"/>
                         <w:rPr>
                           <w:rFonts w:ascii="Arial" w:hAnsi="Arial" w:cs="Arial"/>
                           <w:sz w:val="12"/>
@@ -9660,7 +9354,7 @@
                               <w:tabs>
                                 <w:tab w:val="left" w:pos="1611"/>
                               </w:tabs>
-                              <w:ind w:left="51"/>
+                              <w:ind w:left="32"/>
                               <w:rPr>
                                 <w:rFonts w:ascii="Arial" w:hAnsi="Arial" w:cs="Arial"/>
                                 <w:sz w:val="12"/>
@@ -9728,7 +9422,7 @@
                         <w:tabs>
                           <w:tab w:val="left" w:pos="1611"/>
                         </w:tabs>
-                        <w:ind w:left="51"/>
+                        <w:ind w:left="32"/>
                         <w:rPr>
                           <w:rFonts w:ascii="Arial" w:hAnsi="Arial" w:cs="Arial"/>
                           <w:sz w:val="12"/>
@@ -9792,7 +9486,7 @@
                   <wp:posOffset>-492125</wp:posOffset>
                 </wp:positionH>
                 <wp:positionV relativeFrom="paragraph">
-                  <wp:posOffset>5874385</wp:posOffset>
+                  <wp:posOffset>5880735</wp:posOffset>
                 </wp:positionV>
                 <wp:extent cx="1075690" cy="253365"/>
                 <wp:effectExtent l="0" t="0" r="0" b="0"/>
@@ -9890,7 +9584,7 @@
           </mc:Choice>
           <mc:Fallback>
             <w:pict>
-              <v:shape w14:anchorId="633B7939" id="_x0000_s1089" type="#_x0000_t202" style="position:absolute;left:0;text-align:left;margin-left:-38.75pt;margin-top:462.55pt;width:84.7pt;height:19.95pt;z-index:251485184;visibility:visible;mso-wrap-style:square;mso-width-percent:0;mso-height-percent:0;mso-wrap-distance-left:9pt;mso-wrap-distance-top:3.6pt;mso-wrap-distance-right:9pt;mso-wrap-distance-bottom:3.6pt;mso-position-horizontal:absolute;mso-position-horizontal-relative:margin;mso-position-vertical:absolute;mso-position-vertical-relative:text;mso-width-percent:0;mso-height-percent:0;mso-width-relative:margin;mso-height-relative:margin;v-text-anchor:top" o:gfxdata="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" filled="f" stroked="f">
+              <v:shape w14:anchorId="633B7939" id="_x0000_s1089" type="#_x0000_t202" style="position:absolute;left:0;text-align:left;margin-left:-38.75pt;margin-top:463.05pt;width:84.7pt;height:19.95pt;z-index:251485184;visibility:visible;mso-wrap-style:square;mso-width-percent:0;mso-height-percent:0;mso-wrap-distance-left:9pt;mso-wrap-distance-top:3.6pt;mso-wrap-distance-right:9pt;mso-wrap-distance-bottom:3.6pt;mso-position-horizontal:absolute;mso-position-horizontal-relative:margin;mso-position-vertical:absolute;mso-position-vertical-relative:text;mso-width-percent:0;mso-height-percent:0;mso-width-relative:margin;mso-height-relative:margin;v-text-anchor:top" o:gfxdata="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" filled="f" stroked="f">
                 <v:textbox>
                   <w:txbxContent>
                     <w:p>
@@ -9962,7 +9656,7 @@
                   <wp:posOffset>2296160</wp:posOffset>
                 </wp:positionH>
                 <wp:positionV relativeFrom="paragraph">
-                  <wp:posOffset>5882005</wp:posOffset>
+                  <wp:posOffset>5875655</wp:posOffset>
                 </wp:positionV>
                 <wp:extent cx="2074545" cy="253365"/>
                 <wp:effectExtent l="0" t="0" r="0" b="0"/>
@@ -9997,6 +9691,9 @@
                         <w:txbxContent>
                           <w:p>
                             <w:pPr>
+                              <w:tabs>
+                                <w:tab w:val="left" w:pos="1513"/>
+                              </w:tabs>
                               <w:rPr>
                                 <w:rFonts w:ascii="Arial" w:hAnsi="Arial" w:cs="Arial"/>
                                 <w:sz w:val="16"/>
@@ -10009,63 +9706,16 @@
                                 <w:sz w:val="16"/>
                                 <w:szCs w:val="16"/>
                               </w:rPr>
-                              <w:t>F CFA                        Mode de règlement</w:t>
-                            </w:r>
-                          </w:p>
-                          <w:p>
-                            <w:pPr>
-                              <w:rPr>
-                                <w:rFonts w:ascii="Arial" w:hAnsi="Arial" w:cs="Arial"/>
-                                <w:b/>
-                                <w:bCs/>
-                                <w:sz w:val="16"/>
-                                <w:szCs w:val="16"/>
-                              </w:rPr>
-                            </w:pPr>
-                            <w:r>
-                              <w:rPr>
-                                <w:rFonts w:ascii="Arial" w:hAnsi="Arial" w:cs="Arial"/>
-                                <w:b/>
-                                <w:bCs/>
-                                <w:sz w:val="16"/>
-                                <w:szCs w:val="16"/>
-                              </w:rPr>
-                              <w:t xml:space="preserve">F CFA                   </w:t>
-                            </w:r>
-                            <w:r>
-                              <w:rPr>
-                                <w:rFonts w:ascii="Arial" w:hAnsi="Arial" w:cs="Arial"/>
-                                <w:b/>
-                                <w:bCs/>
-                                <w:sz w:val="16"/>
-                                <w:szCs w:val="16"/>
-                              </w:rPr>
-                              <w:t xml:space="preserve">     Mode de règlement</w:t>
-                            </w:r>
-                          </w:p>
-                          <w:p>
-                            <w:pPr>
-                              <w:rPr>
-                                <w:rFonts w:ascii="Arial" w:hAnsi="Arial" w:cs="Arial"/>
-                                <w:sz w:val="16"/>
-                                <w:szCs w:val="16"/>
-                              </w:rPr>
-                            </w:pPr>
-                            <w:r>
-                              <w:rPr>
-                                <w:rFonts w:ascii="Arial" w:hAnsi="Arial" w:cs="Arial"/>
-                                <w:sz w:val="16"/>
-                                <w:szCs w:val="16"/>
-                              </w:rPr>
-                              <w:t xml:space="preserve">    </w:t>
-                            </w:r>
-                            <w:r>
-                              <w:rPr>
-                                <w:rFonts w:ascii="Arial" w:hAnsi="Arial" w:cs="Arial"/>
-                                <w:sz w:val="16"/>
-                                <w:szCs w:val="16"/>
-                              </w:rPr>
-                              <w:t xml:space="preserve">             </w:t>
+                              <w:t xml:space="preserve">F CFA</w:t>
+                            </w:r>
+                            <w:r>
+                              <w:rPr>
+                                <w:rFonts w:ascii="Arial" w:hAnsi="Arial" w:cs="Arial"/>
+                                <w:sz w:val="16"/>
+                                <w:szCs w:val="16"/>
+                              </w:rPr>
+                              <w:tab/>
+                              <w:t xml:space="preserve">Mode de règlement</w:t>
                             </w:r>
                           </w:p>
                         </w:txbxContent>
@@ -10087,11 +9737,14 @@
           </mc:Choice>
           <mc:Fallback>
             <w:pict>
-              <v:shape w14:anchorId="2057670F" id="_x0000_s1090" type="#_x0000_t202" style="position:absolute;left:0;text-align:left;margin-left:180.8pt;margin-top:463.15pt;width:163.35pt;height:19.95pt;z-index:251487232;visibility:visible;mso-wrap-style:square;mso-width-percent:0;mso-height-percent:0;mso-wrap-distance-left:9pt;mso-wrap-distance-top:3.6pt;mso-wrap-distance-right:9pt;mso-wrap-distance-bottom:3.6pt;mso-position-horizontal:absolute;mso-position-horizontal-relative:margin;mso-position-vertical:absolute;mso-position-vertical-relative:text;mso-width-percent:0;mso-height-percent:0;mso-width-relative:margin;mso-height-relative:margin;v-text-anchor:top" o:gfxdata="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" filled="f" stroked="f">
+              <v:shape w14:anchorId="2057670F" id="_x0000_s1090" type="#_x0000_t202" style="position:absolute;left:0;text-align:left;margin-left:180.8pt;margin-top:462.65pt;width:163.35pt;height:19.95pt;z-index:251487232;visibility:visible;mso-wrap-style:square;mso-width-percent:0;mso-height-percent:0;mso-wrap-distance-left:9pt;mso-wrap-distance-top:3.6pt;mso-wrap-distance-right:9pt;mso-wrap-distance-bottom:3.6pt;mso-position-horizontal:absolute;mso-position-horizontal-relative:margin;mso-position-vertical:absolute;mso-position-vertical-relative:text;mso-width-percent:0;mso-height-percent:0;mso-width-relative:margin;mso-height-relative:margin;v-text-anchor:top" o:gfxdata="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" filled="f" stroked="f">
                 <v:textbox>
                   <w:txbxContent>
                     <w:p>
                       <w:pPr>
+                        <w:tabs>
+                          <w:tab w:val="left" w:pos="1513"/>
+                        </w:tabs>
                         <w:rPr>
                           <w:rFonts w:ascii="Arial" w:hAnsi="Arial" w:cs="Arial"/>
                           <w:sz w:val="16"/>
@@ -10104,63 +9757,16 @@
                           <w:sz w:val="16"/>
                           <w:szCs w:val="16"/>
                         </w:rPr>
-                        <w:t>F CFA                        Mode de règlement</w:t>
-                      </w:r>
-                    </w:p>
-                    <w:p>
-                      <w:pPr>
-                        <w:rPr>
-                          <w:rFonts w:ascii="Arial" w:hAnsi="Arial" w:cs="Arial"/>
-                          <w:b/>
-                          <w:bCs/>
-                          <w:sz w:val="16"/>
-                          <w:szCs w:val="16"/>
-                        </w:rPr>
-                      </w:pPr>
-                      <w:r>
-                        <w:rPr>
-                          <w:rFonts w:ascii="Arial" w:hAnsi="Arial" w:cs="Arial"/>
-                          <w:b/>
-                          <w:bCs/>
-                          <w:sz w:val="16"/>
-                          <w:szCs w:val="16"/>
-                        </w:rPr>
-                        <w:t xml:space="preserve">F CFA                   </w:t>
-                      </w:r>
-                      <w:r>
-                        <w:rPr>
-                          <w:rFonts w:ascii="Arial" w:hAnsi="Arial" w:cs="Arial"/>
-                          <w:b/>
-                          <w:bCs/>
-                          <w:sz w:val="16"/>
-                          <w:szCs w:val="16"/>
-                        </w:rPr>
-                        <w:t xml:space="preserve">     Mode de règlement</w:t>
-                      </w:r>
-                    </w:p>
-                    <w:p>
-                      <w:pPr>
-                        <w:rPr>
-                          <w:rFonts w:ascii="Arial" w:hAnsi="Arial" w:cs="Arial"/>
-                          <w:sz w:val="16"/>
-                          <w:szCs w:val="16"/>
-                        </w:rPr>
-                      </w:pPr>
-                      <w:r>
-                        <w:rPr>
-                          <w:rFonts w:ascii="Arial" w:hAnsi="Arial" w:cs="Arial"/>
-                          <w:sz w:val="16"/>
-                          <w:szCs w:val="16"/>
-                        </w:rPr>
-                        <w:t xml:space="preserve">    </w:t>
-                      </w:r>
-                      <w:r>
-                        <w:rPr>
-                          <w:rFonts w:ascii="Arial" w:hAnsi="Arial" w:cs="Arial"/>
-                          <w:sz w:val="16"/>
-                          <w:szCs w:val="16"/>
-                        </w:rPr>
-                        <w:t xml:space="preserve">             </w:t>
+                        <w:t xml:space="preserve">F CFA</w:t>
+                      </w:r>
+                      <w:r>
+                        <w:rPr>
+                          <w:rFonts w:ascii="Arial" w:hAnsi="Arial" w:cs="Arial"/>
+                          <w:sz w:val="16"/>
+                          <w:szCs w:val="16"/>
+                        </w:rPr>
+                        <w:tab/>
+                        <w:t xml:space="preserve">Mode de règlement</w:t>
                       </w:r>
                     </w:p>
                   </w:txbxContent>
@@ -10391,6 +9997,10 @@
                         <w:txbxContent>
                           <w:p>
                             <w:pPr>
+                              <w:tabs>
+                                <w:tab w:val="left" w:pos="1549"/>
+                              </w:tabs>
+                              <w:ind w:left="40"/>
                               <w:rPr>
                                 <w:rFonts w:ascii="Arial" w:hAnsi="Arial" w:cs="Arial"/>
                                 <w:sz w:val="16"/>
@@ -10403,32 +10013,16 @@
                                 <w:sz w:val="16"/>
                                 <w:szCs w:val="16"/>
                               </w:rPr>
-                              <w:t xml:space="preserve"> F CFA                        Banque de l’émetteur</w:t>
-                            </w:r>
-                          </w:p>
-                          <w:p>
-                            <w:pPr>
-                              <w:rPr>
-                                <w:rFonts w:ascii="Arial" w:hAnsi="Arial" w:cs="Arial"/>
-                                <w:sz w:val="16"/>
-                                <w:szCs w:val="16"/>
-                              </w:rPr>
-                            </w:pPr>
-                            <w:r>
-                              <w:rPr>
-                                <w:rFonts w:ascii="Arial" w:hAnsi="Arial" w:cs="Arial"/>
-                                <w:sz w:val="16"/>
-                                <w:szCs w:val="16"/>
-                              </w:rPr>
-                              <w:t xml:space="preserve">    </w:t>
-                            </w:r>
-                            <w:r>
-                              <w:rPr>
-                                <w:rFonts w:ascii="Arial" w:hAnsi="Arial" w:cs="Arial"/>
-                                <w:sz w:val="16"/>
-                                <w:szCs w:val="16"/>
-                              </w:rPr>
-                              <w:t xml:space="preserve">             </w:t>
+                              <w:t xml:space="preserve">F CFA</w:t>
+                            </w:r>
+                            <w:r>
+                              <w:rPr>
+                                <w:rFonts w:ascii="Arial" w:hAnsi="Arial" w:cs="Arial"/>
+                                <w:sz w:val="16"/>
+                                <w:szCs w:val="16"/>
+                              </w:rPr>
+                              <w:tab/>
+                              <w:t xml:space="preserve">Banque de l’émetteur</w:t>
                             </w:r>
                           </w:p>
                         </w:txbxContent>
@@ -10455,6 +10049,10 @@
                   <w:txbxContent>
                     <w:p>
                       <w:pPr>
+                        <w:tabs>
+                          <w:tab w:val="left" w:pos="1549"/>
+                        </w:tabs>
+                        <w:ind w:left="40"/>
                         <w:rPr>
                           <w:rFonts w:ascii="Arial" w:hAnsi="Arial" w:cs="Arial"/>
                           <w:sz w:val="16"/>
@@ -10467,32 +10065,16 @@
                           <w:sz w:val="16"/>
                           <w:szCs w:val="16"/>
                         </w:rPr>
-                        <w:t xml:space="preserve"> F CFA                        Banque de l’émetteur</w:t>
-                      </w:r>
-                    </w:p>
-                    <w:p>
-                      <w:pPr>
-                        <w:rPr>
-                          <w:rFonts w:ascii="Arial" w:hAnsi="Arial" w:cs="Arial"/>
-                          <w:sz w:val="16"/>
-                          <w:szCs w:val="16"/>
-                        </w:rPr>
-                      </w:pPr>
-                      <w:r>
-                        <w:rPr>
-                          <w:rFonts w:ascii="Arial" w:hAnsi="Arial" w:cs="Arial"/>
-                          <w:sz w:val="16"/>
-                          <w:szCs w:val="16"/>
-                        </w:rPr>
-                        <w:t xml:space="preserve">    </w:t>
-                      </w:r>
-                      <w:r>
-                        <w:rPr>
-                          <w:rFonts w:ascii="Arial" w:hAnsi="Arial" w:cs="Arial"/>
-                          <w:sz w:val="16"/>
-                          <w:szCs w:val="16"/>
-                        </w:rPr>
-                        <w:t xml:space="preserve">             </w:t>
+                        <w:t xml:space="preserve">F CFA</w:t>
+                      </w:r>
+                      <w:r>
+                        <w:rPr>
+                          <w:rFonts w:ascii="Arial" w:hAnsi="Arial" w:cs="Arial"/>
+                          <w:sz w:val="16"/>
+                          <w:szCs w:val="16"/>
+                        </w:rPr>
+                        <w:tab/>
+                        <w:t xml:space="preserve">Banque de l’émetteur</w:t>
                       </w:r>
                     </w:p>
                   </w:txbxContent>
@@ -10698,6 +10280,7 @@
                               <w:tabs>
                                 <w:tab w:val="left" w:pos="2791"/>
                               </w:tabs>
+                              <w:ind w:left="13"/>
                               <w:rPr>
                                 <w:rFonts w:ascii="Arial" w:hAnsi="Arial" w:cs="Arial"/>
                                 <w:sz w:val="12"/>
@@ -10749,6 +10332,7 @@
                         <w:tabs>
                           <w:tab w:val="left" w:pos="2791"/>
                         </w:tabs>
+                        <w:ind w:left="13"/>
                         <w:rPr>
                           <w:rFonts w:ascii="Arial" w:hAnsi="Arial" w:cs="Arial"/>
                           <w:sz w:val="12"/>
@@ -10796,7 +10380,7 @@
                   <wp:posOffset>-591820</wp:posOffset>
                 </wp:positionH>
                 <wp:positionV relativeFrom="paragraph">
-                  <wp:posOffset>2918460</wp:posOffset>
+                  <wp:posOffset>2924810</wp:posOffset>
                 </wp:positionV>
                 <wp:extent cx="3103880" cy="230505"/>
                 <wp:effectExtent l="0" t="0" r="0" b="0"/>
@@ -10831,6 +10415,7 @@
                         <w:txbxContent>
                           <w:p>
                             <w:pPr>
+                              <w:ind w:left="13"/>
                               <w:rPr>
                                 <w:rFonts w:ascii="Arial" w:hAnsi="Arial" w:cs="Arial"/>
                                 <w:sz w:val="12"/>
@@ -10843,23 +10428,15 @@
                                 <w:sz w:val="16"/>
                                 <w:szCs w:val="16"/>
                               </w:rPr>
-                              <w:t>Tare camion</w:t>
-                            </w:r>
-                            <w:r>
-                              <w:rPr>
-                                <w:rFonts w:ascii="Arial" w:hAnsi="Arial" w:cs="Arial"/>
-                                <w:sz w:val="16"/>
-                                <w:szCs w:val="16"/>
-                              </w:rPr>
-                              <w:t xml:space="preserve"> : </w:t>
-                            </w:r>
-                            <w:r>
-                              <w:rPr>
-                                <w:rFonts w:ascii="Arial" w:hAnsi="Arial" w:cs="Arial"/>
-                                <w:sz w:val="16"/>
-                                <w:szCs w:val="16"/>
-                              </w:rPr>
-                              <w:t xml:space="preserve"> </w:t>
+                              <w:t xml:space="preserve">Tare camion</w:t>
+                            </w:r>
+                            <w:r>
+                              <w:rPr>
+                                <w:rFonts w:ascii="Arial" w:hAnsi="Arial" w:cs="Arial"/>
+                                <w:sz w:val="16"/>
+                                <w:szCs w:val="16"/>
+                              </w:rPr>
+                              <w:t xml:space="preserve"> :</w:t>
                             </w:r>
                           </w:p>
                         </w:txbxContent>
@@ -10881,11 +10458,12 @@
           </mc:Choice>
           <mc:Fallback>
             <w:pict>
-              <v:shape w14:anchorId="7D975BEC" id="_x0000_s1095" type="#_x0000_t202" style="position:absolute;left:0;text-align:left;margin-left:-46.6pt;margin-top:229.8pt;width:244.4pt;height:18.15pt;z-index:251288576;visibility:visible;mso-wrap-style:square;mso-width-percent:0;mso-height-percent:0;mso-wrap-distance-left:9pt;mso-wrap-distance-top:3.6pt;mso-wrap-distance-right:9pt;mso-wrap-distance-bottom:3.6pt;mso-position-horizontal:absolute;mso-position-horizontal-relative:margin;mso-position-vertical:absolute;mso-position-vertical-relative:text;mso-width-percent:0;mso-height-percent:0;mso-width-relative:margin;mso-height-relative:margin;v-text-anchor:top" o:gfxdata="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" filled="f" stroked="f">
+              <v:shape w14:anchorId="7D975BEC" id="_x0000_s1095" type="#_x0000_t202" style="position:absolute;left:0;text-align:left;margin-left:-46.6pt;margin-top:230.3pt;width:244.4pt;height:18.15pt;z-index:251288576;visibility:visible;mso-wrap-style:square;mso-width-percent:0;mso-height-percent:0;mso-wrap-distance-left:9pt;mso-wrap-distance-top:3.6pt;mso-wrap-distance-right:9pt;mso-wrap-distance-bottom:3.6pt;mso-position-horizontal:absolute;mso-position-horizontal-relative:margin;mso-position-vertical:absolute;mso-position-vertical-relative:text;mso-width-percent:0;mso-height-percent:0;mso-width-relative:margin;mso-height-relative:margin;v-text-anchor:top" o:gfxdata="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" filled="f" stroked="f">
                 <v:textbox>
                   <w:txbxContent>
                     <w:p>
                       <w:pPr>
+                        <w:ind w:left="13"/>
                         <w:rPr>
                           <w:rFonts w:ascii="Arial" w:hAnsi="Arial" w:cs="Arial"/>
                           <w:sz w:val="12"/>
@@ -10898,23 +10476,15 @@
                           <w:sz w:val="16"/>
                           <w:szCs w:val="16"/>
                         </w:rPr>
-                        <w:t>Tare camion</w:t>
-                      </w:r>
-                      <w:r>
-                        <w:rPr>
-                          <w:rFonts w:ascii="Arial" w:hAnsi="Arial" w:cs="Arial"/>
-                          <w:sz w:val="16"/>
-                          <w:szCs w:val="16"/>
-                        </w:rPr>
-                        <w:t xml:space="preserve"> : </w:t>
-                      </w:r>
-                      <w:r>
-                        <w:rPr>
-                          <w:rFonts w:ascii="Arial" w:hAnsi="Arial" w:cs="Arial"/>
-                          <w:sz w:val="16"/>
-                          <w:szCs w:val="16"/>
-                        </w:rPr>
-                        <w:t xml:space="preserve"> </w:t>
+                        <w:t xml:space="preserve">Tare camion</w:t>
+                      </w:r>
+                      <w:r>
+                        <w:rPr>
+                          <w:rFonts w:ascii="Arial" w:hAnsi="Arial" w:cs="Arial"/>
+                          <w:sz w:val="16"/>
+                          <w:szCs w:val="16"/>
+                        </w:rPr>
+                        <w:t xml:space="preserve"> :</w:t>
                       </w:r>
                     </w:p>
                   </w:txbxContent>
@@ -10978,6 +10548,7 @@
                               <w:tabs>
                                 <w:tab w:val="right" w:pos="3290"/>
                               </w:tabs>
+                              <w:ind w:left="12"/>
                               <w:rPr>
                                 <w:rFonts w:ascii="Arial" w:hAnsi="Arial" w:cs="Arial"/>
                                 <w:sz w:val="12"/>
@@ -11037,6 +10608,7 @@
                         <w:tabs>
                           <w:tab w:val="right" w:pos="3290"/>
                         </w:tabs>
+                        <w:ind w:left="12"/>
                         <w:rPr>
                           <w:rFonts w:ascii="Arial" w:hAnsi="Arial" w:cs="Arial"/>
                           <w:sz w:val="12"/>
@@ -11092,7 +10664,7 @@
                   <wp:posOffset>-591185</wp:posOffset>
                 </wp:positionH>
                 <wp:positionV relativeFrom="paragraph">
-                  <wp:posOffset>2593975</wp:posOffset>
+                  <wp:posOffset>2600325</wp:posOffset>
                 </wp:positionV>
                 <wp:extent cx="3103880" cy="230505"/>
                 <wp:effectExtent l="0" t="0" r="0" b="0"/>
@@ -11130,6 +10702,7 @@
                               <w:tabs>
                                 <w:tab w:val="left" w:pos="2790"/>
                               </w:tabs>
+                              <w:ind w:left="12"/>
                               <w:rPr>
                                 <w:rFonts w:ascii="Arial" w:hAnsi="Arial" w:cs="Arial"/>
                                 <w:sz w:val="12"/>
@@ -11173,7 +10746,7 @@
           </mc:Choice>
           <mc:Fallback>
             <w:pict>
-              <v:shape w14:anchorId="2AF748ED" id="_x0000_s1097" type="#_x0000_t202" style="position:absolute;left:0;text-align:left;margin-left:-46.55pt;margin-top:204.25pt;width:244.4pt;height:18.15pt;z-index:251658259;visibility:visible;mso-wrap-style:square;mso-width-percent:0;mso-height-percent:0;mso-wrap-distance-left:9pt;mso-wrap-distance-top:3.6pt;mso-wrap-distance-right:9pt;mso-wrap-distance-bottom:3.6pt;mso-position-horizontal:absolute;mso-position-horizontal-relative:margin;mso-position-vertical:absolute;mso-position-vertical-relative:text;mso-width-percent:0;mso-height-percent:0;mso-width-relative:margin;mso-height-relative:margin;v-text-anchor:top" o:gfxdata="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" filled="f" stroked="f">
+              <v:shape w14:anchorId="2AF748ED" id="_x0000_s1097" type="#_x0000_t202" style="position:absolute;left:0;text-align:left;margin-left:-46.55pt;margin-top:204.75pt;width:244.4pt;height:18.15pt;z-index:251658259;visibility:visible;mso-wrap-style:square;mso-width-percent:0;mso-height-percent:0;mso-wrap-distance-left:9pt;mso-wrap-distance-top:3.6pt;mso-wrap-distance-right:9pt;mso-wrap-distance-bottom:3.6pt;mso-position-horizontal:absolute;mso-position-horizontal-relative:margin;mso-position-vertical:absolute;mso-position-vertical-relative:text;mso-width-percent:0;mso-height-percent:0;mso-width-relative:margin;mso-height-relative:margin;v-text-anchor:top" o:gfxdata="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" filled="f" stroked="f">
                 <v:textbox>
                   <w:txbxContent>
                     <w:p>
@@ -11181,6 +10754,7 @@
                         <w:tabs>
                           <w:tab w:val="left" w:pos="2790"/>
                         </w:tabs>
+                        <w:ind w:left="12"/>
                         <w:rPr>
                           <w:rFonts w:ascii="Arial" w:hAnsi="Arial" w:cs="Arial"/>
                           <w:sz w:val="12"/>
@@ -11228,7 +10802,7 @@
                   <wp:posOffset>-591820</wp:posOffset>
                 </wp:positionH>
                 <wp:positionV relativeFrom="paragraph">
-                  <wp:posOffset>2753360</wp:posOffset>
+                  <wp:posOffset>2759710</wp:posOffset>
                 </wp:positionV>
                 <wp:extent cx="3103880" cy="230505"/>
                 <wp:effectExtent l="0" t="0" r="0" b="0"/>
@@ -11266,6 +10840,7 @@
                               <w:tabs>
                                 <w:tab w:val="left" w:pos="2791"/>
                               </w:tabs>
+                              <w:ind w:left="13"/>
                               <w:rPr>
                                 <w:rFonts w:ascii="Arial" w:hAnsi="Arial" w:cs="Arial"/>
                                 <w:sz w:val="12"/>
@@ -11317,7 +10892,7 @@
           </mc:Choice>
           <mc:Fallback>
             <w:pict>
-              <v:shape w14:anchorId="6CB65F42" id="_x0000_s1098" type="#_x0000_t202" style="position:absolute;left:0;text-align:left;margin-left:-46.6pt;margin-top:216.8pt;width:244.4pt;height:18.15pt;z-index:251658260;visibility:visible;mso-wrap-style:square;mso-width-percent:0;mso-height-percent:0;mso-wrap-distance-left:9pt;mso-wrap-distance-top:3.6pt;mso-wrap-distance-right:9pt;mso-wrap-distance-bottom:3.6pt;mso-position-horizontal:absolute;mso-position-horizontal-relative:margin;mso-position-vertical:absolute;mso-position-vertical-relative:text;mso-width-percent:0;mso-height-percent:0;mso-width-relative:margin;mso-height-relative:margin;v-text-anchor:top" o:gfxdata="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" filled="f" stroked="f">
+              <v:shape w14:anchorId="6CB65F42" id="_x0000_s1098" type="#_x0000_t202" style="position:absolute;left:0;text-align:left;margin-left:-46.6pt;margin-top:217.3pt;width:244.4pt;height:18.15pt;z-index:251658260;visibility:visible;mso-wrap-style:square;mso-width-percent:0;mso-height-percent:0;mso-wrap-distance-left:9pt;mso-wrap-distance-top:3.6pt;mso-wrap-distance-right:9pt;mso-wrap-distance-bottom:3.6pt;mso-position-horizontal:absolute;mso-position-horizontal-relative:margin;mso-position-vertical:absolute;mso-position-vertical-relative:text;mso-width-percent:0;mso-height-percent:0;mso-width-relative:margin;mso-height-relative:margin;v-text-anchor:top" o:gfxdata="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" filled="f" stroked="f">
                 <v:textbox>
                   <w:txbxContent>
                     <w:p>
@@ -11325,6 +10900,7 @@
                         <w:tabs>
                           <w:tab w:val="left" w:pos="2791"/>
                         </w:tabs>
+                        <w:ind w:left="13"/>
                         <w:rPr>
                           <w:rFonts w:ascii="Arial" w:hAnsi="Arial" w:cs="Arial"/>
                           <w:sz w:val="12"/>
@@ -11418,6 +10994,7 @@
                               <w:tabs>
                                 <w:tab w:val="right" w:pos="3291"/>
                               </w:tabs>
+                              <w:ind w:left="13"/>
                               <w:rPr>
                                 <w:rFonts w:ascii="Arial" w:hAnsi="Arial" w:cs="Arial"/>
                                 <w:sz w:val="12"/>
@@ -11469,6 +11046,7 @@
                         <w:tabs>
                           <w:tab w:val="right" w:pos="3291"/>
                         </w:tabs>
+                        <w:ind w:left="13"/>
                         <w:rPr>
                           <w:rFonts w:ascii="Arial" w:hAnsi="Arial" w:cs="Arial"/>
                           <w:sz w:val="12"/>
@@ -11554,6 +11132,7 @@
                               <w:tabs>
                                 <w:tab w:val="left" w:pos="2600"/>
                               </w:tabs>
+                              <w:ind w:left="25"/>
                               <w:rPr>
                                 <w:rFonts w:ascii="Arial" w:hAnsi="Arial" w:cs="Arial"/>
                                 <w:sz w:val="12"/>
@@ -11605,6 +11184,7 @@
                         <w:tabs>
                           <w:tab w:val="left" w:pos="2600"/>
                         </w:tabs>
+                        <w:ind w:left="25"/>
                         <w:rPr>
                           <w:rFonts w:ascii="Arial" w:hAnsi="Arial" w:cs="Arial"/>
                           <w:sz w:val="12"/>
@@ -11652,7 +11232,7 @@
                   <wp:posOffset>3110865</wp:posOffset>
                 </wp:positionH>
                 <wp:positionV relativeFrom="paragraph">
-                  <wp:posOffset>2604770</wp:posOffset>
+                  <wp:posOffset>2598420</wp:posOffset>
                 </wp:positionV>
                 <wp:extent cx="3050540" cy="199390"/>
                 <wp:effectExtent l="0" t="0" r="0" b="0"/>
@@ -11690,6 +11270,7 @@
                               <w:tabs>
                                 <w:tab w:val="left" w:pos="2600"/>
                               </w:tabs>
+                              <w:ind w:left="25"/>
                               <w:rPr>
                                 <w:rFonts w:ascii="Arial" w:hAnsi="Arial" w:cs="Arial"/>
                                 <w:sz w:val="12"/>
@@ -11741,7 +11322,7 @@
           </mc:Choice>
           <mc:Fallback>
             <w:pict>
-              <v:shape w14:anchorId="7B73B43D" id="_x0000_s1101" type="#_x0000_t202" style="position:absolute;left:0;text-align:left;margin-left:244.95pt;margin-top:205.1pt;width:240.2pt;height:15.7pt;z-index:251658267;visibility:visible;mso-wrap-style:square;mso-width-percent:0;mso-height-percent:0;mso-wrap-distance-left:9pt;mso-wrap-distance-top:3.6pt;mso-wrap-distance-right:9pt;mso-wrap-distance-bottom:3.6pt;mso-position-horizontal:absolute;mso-position-horizontal-relative:margin;mso-position-vertical:absolute;mso-position-vertical-relative:text;mso-width-percent:0;mso-height-percent:0;mso-width-relative:margin;mso-height-relative:margin;v-text-anchor:top" o:gfxdata="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" filled="f" stroked="f">
+              <v:shape w14:anchorId="7B73B43D" id="_x0000_s1101" type="#_x0000_t202" style="position:absolute;left:0;text-align:left;margin-left:244.95pt;margin-top:204.6pt;width:240.2pt;height:15.7pt;z-index:251658267;visibility:visible;mso-wrap-style:square;mso-width-percent:0;mso-height-percent:0;mso-wrap-distance-left:9pt;mso-wrap-distance-top:3.6pt;mso-wrap-distance-right:9pt;mso-wrap-distance-bottom:3.6pt;mso-position-horizontal:absolute;mso-position-horizontal-relative:margin;mso-position-vertical:absolute;mso-position-vertical-relative:text;mso-width-percent:0;mso-height-percent:0;mso-width-relative:margin;mso-height-relative:margin;v-text-anchor:top" o:gfxdata="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" filled="f" stroked="f">
                 <v:textbox>
                   <w:txbxContent>
                     <w:p>
@@ -11749,6 +11330,7 @@
                         <w:tabs>
                           <w:tab w:val="left" w:pos="2600"/>
                         </w:tabs>
+                        <w:ind w:left="25"/>
                         <w:rPr>
                           <w:rFonts w:ascii="Arial" w:hAnsi="Arial" w:cs="Arial"/>
                           <w:sz w:val="12"/>
@@ -11804,7 +11386,7 @@
                   <wp:posOffset>3118485</wp:posOffset>
                 </wp:positionH>
                 <wp:positionV relativeFrom="paragraph">
-                  <wp:posOffset>2773680</wp:posOffset>
+                  <wp:posOffset>2767330</wp:posOffset>
                 </wp:positionV>
                 <wp:extent cx="3050540" cy="199390"/>
                 <wp:effectExtent l="0" t="0" r="0" b="0"/>
@@ -11842,6 +11424,7 @@
                               <w:tabs>
                                 <w:tab w:val="left" w:pos="2588"/>
                               </w:tabs>
+                              <w:ind w:left="13"/>
                               <w:rPr>
                                 <w:rFonts w:ascii="Arial" w:hAnsi="Arial" w:cs="Arial"/>
                                 <w:sz w:val="12"/>
@@ -11885,7 +11468,7 @@
           </mc:Choice>
           <mc:Fallback>
             <w:pict>
-              <v:shape w14:anchorId="13EBC370" id="_x0000_s1102" type="#_x0000_t202" style="position:absolute;left:0;text-align:left;margin-left:245.55pt;margin-top:218.4pt;width:240.2pt;height:15.7pt;z-index:251658268;visibility:visible;mso-wrap-style:square;mso-width-percent:0;mso-height-percent:0;mso-wrap-distance-left:9pt;mso-wrap-distance-top:3.6pt;mso-wrap-distance-right:9pt;mso-wrap-distance-bottom:3.6pt;mso-position-horizontal:absolute;mso-position-horizontal-relative:margin;mso-position-vertical:absolute;mso-position-vertical-relative:text;mso-width-percent:0;mso-height-percent:0;mso-width-relative:margin;mso-height-relative:margin;v-text-anchor:top" o:gfxdata="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" filled="f" stroked="f">
+              <v:shape w14:anchorId="13EBC370" id="_x0000_s1102" type="#_x0000_t202" style="position:absolute;left:0;text-align:left;margin-left:245.55pt;margin-top:217.9pt;width:240.2pt;height:15.7pt;z-index:251658268;visibility:visible;mso-wrap-style:square;mso-width-percent:0;mso-height-percent:0;mso-wrap-distance-left:9pt;mso-wrap-distance-top:3.6pt;mso-wrap-distance-right:9pt;mso-wrap-distance-bottom:3.6pt;mso-position-horizontal:absolute;mso-position-horizontal-relative:margin;mso-position-vertical:absolute;mso-position-vertical-relative:text;mso-width-percent:0;mso-height-percent:0;mso-width-relative:margin;mso-height-relative:margin;v-text-anchor:top" o:gfxdata="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" filled="f" stroked="f">
                 <v:textbox>
                   <w:txbxContent>
                     <w:p>
@@ -11893,6 +11476,7 @@
                         <w:tabs>
                           <w:tab w:val="left" w:pos="2588"/>
                         </w:tabs>
+                        <w:ind w:left="13"/>
                         <w:rPr>
                           <w:rFonts w:ascii="Arial" w:hAnsi="Arial" w:cs="Arial"/>
                           <w:sz w:val="12"/>
@@ -11940,7 +11524,7 @@
                   <wp:posOffset>3126105</wp:posOffset>
                 </wp:positionH>
                 <wp:positionV relativeFrom="paragraph">
-                  <wp:posOffset>2943225</wp:posOffset>
+                  <wp:posOffset>2936875</wp:posOffset>
                 </wp:positionV>
                 <wp:extent cx="3050540" cy="199390"/>
                 <wp:effectExtent l="0" t="0" r="0" b="0"/>
@@ -12021,7 +11605,7 @@
           </mc:Choice>
           <mc:Fallback>
             <w:pict>
-              <v:shape w14:anchorId="4285B9BF" id="_x0000_s1103" type="#_x0000_t202" style="position:absolute;left:0;text-align:left;margin-left:246.15pt;margin-top:231.75pt;width:240.2pt;height:15.7pt;z-index:251658269;visibility:visible;mso-wrap-style:square;mso-width-percent:0;mso-height-percent:0;mso-wrap-distance-left:9pt;mso-wrap-distance-top:3.6pt;mso-wrap-distance-right:9pt;mso-wrap-distance-bottom:3.6pt;mso-position-horizontal:absolute;mso-position-horizontal-relative:margin;mso-position-vertical:absolute;mso-position-vertical-relative:text;mso-width-percent:0;mso-height-percent:0;mso-width-relative:margin;mso-height-relative:margin;v-text-anchor:top" o:gfxdata="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" filled="f" stroked="f">
+              <v:shape w14:anchorId="4285B9BF" id="_x0000_s1103" type="#_x0000_t202" style="position:absolute;left:0;text-align:left;margin-left:246.15pt;margin-top:231.25pt;width:240.2pt;height:15.7pt;z-index:251658269;visibility:visible;mso-wrap-style:square;mso-width-percent:0;mso-height-percent:0;mso-wrap-distance-left:9pt;mso-wrap-distance-top:3.6pt;mso-wrap-distance-right:9pt;mso-wrap-distance-bottom:3.6pt;mso-position-horizontal:absolute;mso-position-horizontal-relative:margin;mso-position-vertical:absolute;mso-position-vertical-relative:text;mso-width-percent:0;mso-height-percent:0;mso-width-relative:margin;mso-height-relative:margin;v-text-anchor:top" o:gfxdata="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" filled="f" stroked="f">
                 <v:textbox>
                   <w:txbxContent>
                     <w:p>
@@ -12870,7 +12454,7 @@
                   <wp:posOffset>4110355</wp:posOffset>
                 </wp:positionH>
                 <wp:positionV relativeFrom="paragraph">
-                  <wp:posOffset>1146175</wp:posOffset>
+                  <wp:posOffset>1152525</wp:posOffset>
                 </wp:positionV>
                 <wp:extent cx="2619375" cy="209550"/>
                 <wp:effectExtent l="0" t="0" r="0" b="0"/>
@@ -12951,7 +12535,7 @@
           </mc:Choice>
           <mc:Fallback>
             <w:pict>
-              <v:shape w14:anchorId="52DA9FF9" id="_x0000_s1110" type="#_x0000_t202" style="position:absolute;left:0;text-align:left;margin-left:323.65pt;margin-top:90.25pt;width:206.25pt;height:16.5pt;z-index:251658251;visibility:visible;mso-wrap-style:square;mso-width-percent:0;mso-height-percent:0;mso-wrap-distance-left:9pt;mso-wrap-distance-top:3.6pt;mso-wrap-distance-right:9pt;mso-wrap-distance-bottom:3.6pt;mso-position-horizontal:absolute;mso-position-horizontal-relative:margin;mso-position-vertical:absolute;mso-position-vertical-relative:text;mso-width-percent:0;mso-height-percent:0;mso-width-relative:margin;mso-height-relative:margin;v-text-anchor:top" o:gfxdata="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" filled="f" stroked="f">
+              <v:shape w14:anchorId="52DA9FF9" id="_x0000_s1110" type="#_x0000_t202" style="position:absolute;left:0;text-align:left;margin-left:323.65pt;margin-top:90.75pt;width:206.25pt;height:16.5pt;z-index:251658251;visibility:visible;mso-wrap-style:square;mso-width-percent:0;mso-height-percent:0;mso-wrap-distance-left:9pt;mso-wrap-distance-top:3.6pt;mso-wrap-distance-right:9pt;mso-wrap-distance-bottom:3.6pt;mso-position-horizontal:absolute;mso-position-horizontal-relative:margin;mso-position-vertical:absolute;mso-position-vertical-relative:text;mso-width-percent:0;mso-height-percent:0;mso-width-relative:margin;mso-height-relative:margin;v-text-anchor:top" o:gfxdata="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" filled="f" stroked="f">
                 <v:textbox>
                   <w:txbxContent>
                     <w:p>
@@ -13006,7 +12590,7 @@
                   <wp:posOffset>-575945</wp:posOffset>
                 </wp:positionH>
                 <wp:positionV relativeFrom="paragraph">
-                  <wp:posOffset>1155700</wp:posOffset>
+                  <wp:posOffset>1149350</wp:posOffset>
                 </wp:positionV>
                 <wp:extent cx="2619375" cy="209550"/>
                 <wp:effectExtent l="0" t="0" r="0" b="0"/>
@@ -13044,6 +12628,7 @@
                               <w:tabs>
                                 <w:tab w:val="left" w:pos="1246"/>
                               </w:tabs>
+                              <w:ind w:left="6"/>
                               <w:rPr>
                                 <w:rFonts w:ascii="Arial" w:hAnsi="Arial" w:cs="Arial"/>
                                 <w:sz w:val="12"/>
@@ -13087,7 +12672,7 @@
           </mc:Choice>
           <mc:Fallback>
             <w:pict>
-              <v:shape w14:anchorId="37C9757C" id="_x0000_s1111" type="#_x0000_t202" style="position:absolute;left:0;text-align:left;margin-left:-45.35pt;margin-top:91pt;width:206.25pt;height:16.5pt;z-index:251658250;visibility:visible;mso-wrap-style:square;mso-width-percent:0;mso-height-percent:0;mso-wrap-distance-left:9pt;mso-wrap-distance-top:3.6pt;mso-wrap-distance-right:9pt;mso-wrap-distance-bottom:3.6pt;mso-position-horizontal:absolute;mso-position-horizontal-relative:margin;mso-position-vertical:absolute;mso-position-vertical-relative:text;mso-width-percent:0;mso-height-percent:0;mso-width-relative:margin;mso-height-relative:margin;v-text-anchor:top" o:gfxdata="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" filled="f" stroked="f">
+              <v:shape w14:anchorId="37C9757C" id="_x0000_s1111" type="#_x0000_t202" style="position:absolute;left:0;text-align:left;margin-left:-45.35pt;margin-top:90.5pt;width:206.25pt;height:16.5pt;z-index:251658250;visibility:visible;mso-wrap-style:square;mso-width-percent:0;mso-height-percent:0;mso-wrap-distance-left:9pt;mso-wrap-distance-top:3.6pt;mso-wrap-distance-right:9pt;mso-wrap-distance-bottom:3.6pt;mso-position-horizontal:absolute;mso-position-horizontal-relative:margin;mso-position-vertical:absolute;mso-position-vertical-relative:text;mso-width-percent:0;mso-height-percent:0;mso-width-relative:margin;mso-height-relative:margin;v-text-anchor:top" o:gfxdata="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" filled="f" stroked="f">
                 <v:textbox>
                   <w:txbxContent>
                     <w:p>
@@ -13095,6 +12680,7 @@
                         <w:tabs>
                           <w:tab w:val="left" w:pos="1246"/>
                         </w:tabs>
+                        <w:ind w:left="6"/>
                         <w:rPr>
                           <w:rFonts w:ascii="Arial" w:hAnsi="Arial" w:cs="Arial"/>
                           <w:sz w:val="12"/>
@@ -13142,7 +12728,7 @@
                   <wp:posOffset>3624580</wp:posOffset>
                 </wp:positionH>
                 <wp:positionV relativeFrom="paragraph">
-                  <wp:posOffset>946150</wp:posOffset>
+                  <wp:posOffset>952500</wp:posOffset>
                 </wp:positionV>
                 <wp:extent cx="3381375" cy="247650"/>
                 <wp:effectExtent l="0" t="0" r="0" b="0"/>
@@ -13180,7 +12766,7 @@
                               <w:tabs>
                                 <w:tab w:val="left" w:pos="1991"/>
                               </w:tabs>
-                              <w:ind w:left="751"/>
+                              <w:ind w:left="766"/>
                               <w:rPr>
                                 <w:rFonts w:ascii="Arial" w:hAnsi="Arial" w:cs="Arial"/>
                                 <w:sz w:val="12"/>
@@ -13224,7 +12810,7 @@
           </mc:Choice>
           <mc:Fallback>
             <w:pict>
-              <v:shape w14:anchorId="6328D540" id="_x0000_s1112" type="#_x0000_t202" style="position:absolute;left:0;text-align:left;margin-left:285.4pt;margin-top:74.5pt;width:266.25pt;height:19.5pt;z-index:251658249;visibility:visible;mso-wrap-style:square;mso-width-percent:0;mso-height-percent:0;mso-wrap-distance-left:9pt;mso-wrap-distance-top:3.6pt;mso-wrap-distance-right:9pt;mso-wrap-distance-bottom:3.6pt;mso-position-horizontal:absolute;mso-position-horizontal-relative:margin;mso-position-vertical:absolute;mso-position-vertical-relative:text;mso-width-percent:0;mso-height-percent:0;mso-width-relative:margin;mso-height-relative:margin;v-text-anchor:top" o:gfxdata="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" filled="f" stroked="f">
+              <v:shape w14:anchorId="6328D540" id="_x0000_s1112" type="#_x0000_t202" style="position:absolute;left:0;text-align:left;margin-left:285.4pt;margin-top:75pt;width:266.25pt;height:19.5pt;z-index:251658249;visibility:visible;mso-wrap-style:square;mso-width-percent:0;mso-height-percent:0;mso-wrap-distance-left:9pt;mso-wrap-distance-top:3.6pt;mso-wrap-distance-right:9pt;mso-wrap-distance-bottom:3.6pt;mso-position-horizontal:absolute;mso-position-horizontal-relative:margin;mso-position-vertical:absolute;mso-position-vertical-relative:text;mso-width-percent:0;mso-height-percent:0;mso-width-relative:margin;mso-height-relative:margin;v-text-anchor:top" o:gfxdata="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" filled="f" stroked="f">
                 <v:textbox>
                   <w:txbxContent>
                     <w:p>
@@ -13232,7 +12818,7 @@
                         <w:tabs>
                           <w:tab w:val="left" w:pos="1991"/>
                         </w:tabs>
-                        <w:ind w:left="751"/>
+                        <w:ind w:left="766"/>
                         <w:rPr>
                           <w:rFonts w:ascii="Arial" w:hAnsi="Arial" w:cs="Arial"/>
                           <w:sz w:val="12"/>
@@ -13280,7 +12866,7 @@
                   <wp:posOffset>-575945</wp:posOffset>
                 </wp:positionH>
                 <wp:positionV relativeFrom="paragraph">
-                  <wp:posOffset>946721</wp:posOffset>
+                  <wp:posOffset>940371</wp:posOffset>
                 </wp:positionV>
                 <wp:extent cx="3381375" cy="247650"/>
                 <wp:effectExtent l="0" t="0" r="0" b="0"/>
@@ -13318,6 +12904,7 @@
                               <w:tabs>
                                 <w:tab w:val="left" w:pos="1246"/>
                               </w:tabs>
+                              <w:ind w:left="6"/>
                               <w:rPr>
                                 <w:rFonts w:ascii="Arial" w:hAnsi="Arial" w:cs="Arial"/>
                                 <w:sz w:val="12"/>
@@ -13361,7 +12948,7 @@
           </mc:Choice>
           <mc:Fallback>
             <w:pict>
-              <v:shape w14:anchorId="345A0AC1" id="_x0000_s1113" type="#_x0000_t202" style="position:absolute;left:0;text-align:left;margin-left:-45.35pt;margin-top:74.55pt;width:266.25pt;height:19.5pt;z-index:251658248;visibility:visible;mso-wrap-style:square;mso-width-percent:0;mso-height-percent:0;mso-wrap-distance-left:9pt;mso-wrap-distance-top:3.6pt;mso-wrap-distance-right:9pt;mso-wrap-distance-bottom:3.6pt;mso-position-horizontal:absolute;mso-position-horizontal-relative:margin;mso-position-vertical:absolute;mso-position-vertical-relative:text;mso-width-percent:0;mso-height-percent:0;mso-width-relative:margin;mso-height-relative:margin;v-text-anchor:top" o:gfxdata="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" filled="f" stroked="f">
+              <v:shape w14:anchorId="345A0AC1" id="_x0000_s1113" type="#_x0000_t202" style="position:absolute;left:0;text-align:left;margin-left:-45.35pt;margin-top:74.05pt;width:266.25pt;height:19.5pt;z-index:251658248;visibility:visible;mso-wrap-style:square;mso-width-percent:0;mso-height-percent:0;mso-wrap-distance-left:9pt;mso-wrap-distance-top:3.6pt;mso-wrap-distance-right:9pt;mso-wrap-distance-bottom:3.6pt;mso-position-horizontal:absolute;mso-position-horizontal-relative:margin;mso-position-vertical:absolute;mso-position-vertical-relative:text;mso-width-percent:0;mso-height-percent:0;mso-width-relative:margin;mso-height-relative:margin;v-text-anchor:top" o:gfxdata="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" filled="f" stroked="f">
                 <v:textbox>
                   <w:txbxContent>
                     <w:p>
@@ -13369,6 +12956,7 @@
                         <w:tabs>
                           <w:tab w:val="left" w:pos="1246"/>
                         </w:tabs>
+                        <w:ind w:left="6"/>
                         <w:rPr>
                           <w:rFonts w:ascii="Arial" w:hAnsi="Arial" w:cs="Arial"/>
                           <w:sz w:val="12"/>
@@ -13576,6 +13164,7 @@
                               <w:tabs>
                                 <w:tab w:val="left" w:pos="1740"/>
                               </w:tabs>
+                              <w:ind w:left="10"/>
                               <w:rPr>
                                 <w:rFonts w:ascii="Arial" w:hAnsi="Arial" w:cs="Arial"/>
                                 <w:sz w:val="12"/>
@@ -13627,6 +13216,7 @@
                         <w:tabs>
                           <w:tab w:val="left" w:pos="1740"/>
                         </w:tabs>
+                        <w:ind w:left="10"/>
                         <w:rPr>
                           <w:rFonts w:ascii="Arial" w:hAnsi="Arial" w:cs="Arial"/>
                           <w:sz w:val="12"/>
@@ -13848,6 +13438,7 @@
                               <w:tabs>
                                 <w:tab w:val="left" w:pos="1746"/>
                               </w:tabs>
+                              <w:ind w:left="16"/>
                               <w:rPr>
                                 <w:rFonts w:ascii="Arial" w:hAnsi="Arial" w:cs="Arial"/>
                                 <w:sz w:val="12"/>
@@ -13899,6 +13490,7 @@
                         <w:tabs>
                           <w:tab w:val="left" w:pos="1746"/>
                         </w:tabs>
+                        <w:ind w:left="16"/>
                         <w:rPr>
                           <w:rFonts w:ascii="Arial" w:hAnsi="Arial" w:cs="Arial"/>
                           <w:sz w:val="12"/>

</xml_diff>

<commit_message>
Ticket de pesee : FORMULAIRE de saisie des informations de la fiche de pesee de l'usine (bordereau, tare, sacs et poids de livraison, heures, analyse, grade, nature du produit), enregistre par livraison (table tickets_pesee) et ecrit sur le ticket, aligne ; reduction calculee ; cases Nature du produit pilotables (admin 2026-10-02-129)
</commit_message>
<xml_diff>
--- a/modeles/ticket_de_pesee.docx
+++ b/modeles/ticket_de_pesee.docx
@@ -1195,7 +1195,11 @@
                       </wps:spPr>
                       <wps:txbx>
                         <w:txbxContent>
-                          <w:p/>
+                          <w:p>
+                            <w:r>
+                              <w:t xml:space="preserve">{{MARQUE_USINE}}</w:t>
+                            </w:r>
+                          </w:p>
                         </w:txbxContent>
                       </wps:txbx>
                       <wps:bodyPr rot="0" spcFirstLastPara="0" vertOverflow="overflow" horzOverflow="overflow" vert="horz" wrap="square" lIns="91440" tIns="45720" rIns="91440" bIns="45720" numCol="1" spcCol="0" rtlCol="0" fromWordArt="0" anchor="t" anchorCtr="0" forceAA="0" compatLnSpc="1">
@@ -1215,7 +1219,11 @@
               <v:shape w14:anchorId="1FB82DB8" id="_x0000_s1033" type="#_x0000_t202" style="position:absolute;left:0;text-align:left;margin-left:120.95pt;margin-top:622.5pt;width:14.5pt;height:12.7pt;z-index:251941888;visibility:visible;mso-wrap-style:square;mso-wrap-distance-left:9pt;mso-wrap-distance-top:0;mso-wrap-distance-right:9pt;mso-wrap-distance-bottom:0;mso-position-horizontal:absolute;mso-position-horizontal-relative:text;mso-position-vertical:absolute;mso-position-vertical-relative:text;v-text-anchor:top" o:gfxdata="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" fillcolor="white [3201]" strokeweight="1pt">
                 <v:textbox>
                   <w:txbxContent>
-                    <w:p/>
+                    <w:p>
+                      <w:r>
+                        <w:t xml:space="preserve">{{MARQUE_USINE}}</w:t>
+                      </w:r>
+                    </w:p>
                   </w:txbxContent>
                 </v:textbox>
               </v:shape>
@@ -1268,7 +1276,11 @@
                       </wps:spPr>
                       <wps:txbx>
                         <w:txbxContent>
-                          <w:p/>
+                          <w:p>
+                            <w:r>
+                              <w:t xml:space="preserve">{{MARQUE_PROJET}}</w:t>
+                            </w:r>
+                          </w:p>
                         </w:txbxContent>
                       </wps:txbx>
                       <wps:bodyPr rot="0" spcFirstLastPara="0" vertOverflow="overflow" horzOverflow="overflow" vert="horz" wrap="square" lIns="91440" tIns="45720" rIns="91440" bIns="45720" numCol="1" spcCol="0" rtlCol="0" fromWordArt="0" anchor="t" anchorCtr="0" forceAA="0" compatLnSpc="1">
@@ -1288,7 +1300,11 @@
               <v:shape w14:anchorId="02D84093" id="_x0000_s1034" type="#_x0000_t202" style="position:absolute;left:0;text-align:left;margin-left:17.55pt;margin-top:622.95pt;width:14.5pt;height:12.7pt;z-index:251905024;visibility:visible;mso-wrap-style:square;mso-wrap-distance-left:9pt;mso-wrap-distance-top:0;mso-wrap-distance-right:9pt;mso-wrap-distance-bottom:0;mso-position-horizontal:absolute;mso-position-horizontal-relative:text;mso-position-vertical:absolute;mso-position-vertical-relative:text;v-text-anchor:top" o:gfxdata="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" fillcolor="white [3201]" strokeweight="1pt">
                 <v:textbox>
                   <w:txbxContent>
-                    <w:p/>
+                    <w:p>
+                      <w:r>
+                        <w:t xml:space="preserve">{{MARQUE_PROJET}}</w:t>
+                      </w:r>
+                    </w:p>
                   </w:txbxContent>
                 </v:textbox>
               </v:shape>
@@ -2890,7 +2906,11 @@
                       </wps:spPr>
                       <wps:txbx>
                         <w:txbxContent>
-                          <w:p/>
+                          <w:p>
+                            <w:r>
+                              <w:t xml:space="preserve">{{MARQUE_ORDINAIRE}}</w:t>
+                            </w:r>
+                          </w:p>
                         </w:txbxContent>
                       </wps:txbx>
                       <wps:bodyPr rot="0" spcFirstLastPara="0" vertOverflow="overflow" horzOverflow="overflow" vert="horz" wrap="square" lIns="91440" tIns="45720" rIns="91440" bIns="45720" numCol="1" spcCol="0" rtlCol="0" fromWordArt="0" anchor="t" anchorCtr="0" forceAA="0" compatLnSpc="1">
@@ -2910,7 +2930,11 @@
               <v:shape w14:anchorId="151E76AA" id="_x0000_s1045" type="#_x0000_t202" style="position:absolute;left:0;text-align:left;margin-left:17.35pt;margin-top:610.3pt;width:14.5pt;height:12.7pt;z-index:251885568;visibility:visible;mso-wrap-style:square;mso-wrap-distance-left:9pt;mso-wrap-distance-top:0;mso-wrap-distance-right:9pt;mso-wrap-distance-bottom:0;mso-position-horizontal:absolute;mso-position-horizontal-relative:text;mso-position-vertical:absolute;mso-position-vertical-relative:text;v-text-anchor:top" o:gfxdata="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" fillcolor="white [3201]" strokeweight="1pt">
                 <v:textbox>
                   <w:txbxContent>
-                    <w:p/>
+                    <w:p>
+                      <w:r>
+                        <w:t xml:space="preserve">{{MARQUE_ORDINAIRE}}</w:t>
+                      </w:r>
+                    </w:p>
                   </w:txbxContent>
                 </v:textbox>
               </v:shape>
@@ -10415,6 +10439,9 @@
                         <w:txbxContent>
                           <w:p>
                             <w:pPr>
+                              <w:tabs>
+                                <w:tab w:val="right" w:pos="3291"/>
+                              </w:tabs>
                               <w:ind w:left="13"/>
                               <w:rPr>
                                 <w:rFonts w:ascii="Arial" w:hAnsi="Arial" w:cs="Arial"/>
@@ -10437,6 +10464,15 @@
                                 <w:szCs w:val="16"/>
                               </w:rPr>
                               <w:t xml:space="preserve"> :</w:t>
+                            </w:r>
+                            <w:r>
+                              <w:rPr>
+                                <w:rFonts w:ascii="Arial" w:hAnsi="Arial" w:cs="Arial"/>
+                                <w:sz w:val="16"/>
+                                <w:szCs w:val="16"/>
+                              </w:rPr>
+                              <w:tab/>
+                              <w:t xml:space="preserve">{{TARE_CAMION}}</w:t>
                             </w:r>
                           </w:p>
                         </w:txbxContent>
@@ -10463,6 +10499,9 @@
                   <w:txbxContent>
                     <w:p>
                       <w:pPr>
+                        <w:tabs>
+                          <w:tab w:val="right" w:pos="3291"/>
+                        </w:tabs>
                         <w:ind w:left="13"/>
                         <w:rPr>
                           <w:rFonts w:ascii="Arial" w:hAnsi="Arial" w:cs="Arial"/>
@@ -10485,6 +10524,15 @@
                           <w:szCs w:val="16"/>
                         </w:rPr>
                         <w:t xml:space="preserve"> :</w:t>
+                      </w:r>
+                      <w:r>
+                        <w:rPr>
+                          <w:rFonts w:ascii="Arial" w:hAnsi="Arial" w:cs="Arial"/>
+                          <w:sz w:val="16"/>
+                          <w:szCs w:val="16"/>
+                        </w:rPr>
+                        <w:tab/>
+                        <w:t xml:space="preserve">{{TARE_CAMION}}</w:t>
                       </w:r>
                     </w:p>
                   </w:txbxContent>

</xml_diff>